<commit_message>
Criterion B: ivory, sand and sage palette, new detail sheet and feelings boards
Recolour every board to a warm ivory/sand/sage palette with a near-black
ink, update the Canva deck to 14 pages, and rebuild B.ii-B.iv with typed
Design 1, More/Tell-us-more options, mock scenarios and full ACCESSFMM
tables per design. B.i tags and aesthetics updated to match.

Co-Authored-By: Claude Opus 5.5 <noreply@anthropic.com>
Claude-Session: https://claude.ai/code/session_01N8ZMe6NZXwEKHr9Mfg4w8L
</commit_message>
<xml_diff>
--- a/criterion-b/Criterion_B_i_Design_Specifications_v3.docx
+++ b/criterion-b/Criterion_B_i_Design_Specifications_v3.docx
@@ -344,7 +344,7 @@
                 <w:sz w:val="17"/>
                 <w:szCs w:val="17"/>
               </w:rPr>
-              <w:t xml:space="preserve">Pale teal and cream backgrounds with one muted blue accent. Cards and buttons have rounded corners (12 to 16 px). There is no red anywhere, not even on the help button.</w:t>
+              <w:t>Warm ivory and sand backgrounds with one muted sage green accent and a warm near-black for text. Cards and buttons have rounded corners (12 to 16 px). There is no red anywhere, not even on the help button.</w:t>
             </w:r>
           </w:p>
           <w:p>
@@ -387,7 +387,7 @@
                 <w:sz w:val="17"/>
                 <w:szCs w:val="17"/>
               </w:rPr>
-              <w:t xml:space="preserve">In my Criterion A analysis (Aiii), Wysa's teal and cream branding is deliberately warm and non-clinical, the opposite of the intense red used by hotlines (Wysa, n.d.). A student who opens the app mid-class is already stressed, so the screen should lower that, not look like an emergency service.</w:t>
+              <w:t>In my Criterion A analysis (Aiii), Wysa's teal and cream branding is deliberately warm and non-clinical, the opposite of the intense red used by hotlines (Wysa, n.d.). A student who opens the app mid-class is already stressed, so the screen should lower that, not look like an emergency service. Pause takes the same warm, non-clinical idea in its own beige and sage colours.</w:t>
             </w:r>
           </w:p>
           <w:p>
@@ -873,7 +873,7 @@
                 <w:sz w:val="17"/>
                 <w:szCs w:val="17"/>
               </w:rPr>
-              <w:t xml:space="preserve">Ten tags in two rows. 'How I feel': anxious, overwhelmed, frustrated, low, tired. 'What's happening': test or exam, IA or deadline, in class, friends or people, home.</w:t>
+              <w:t>Two groups of tags. 'How I feel' (12): anxious, stressed, overwhelmed, frustrated, low, tired, then angry, lonely, embarrassed, restless, unmotivated and 'something else' behind a 'More' chip. 'What's happening' (10): test or exam, IA or deadline, in class, presentation, homework, friends or people, then home, sleep, social media and 'something else' behind 'More'. Tapping a feeling offers an optional 'Tell us more' sheet with an exact word (explained in brackets), how strong and how long.</w:t>
             </w:r>
           </w:p>
           <w:p>
@@ -3501,7 +3501,7 @@
                 <w:sz w:val="17"/>
                 <w:szCs w:val="17"/>
               </w:rPr>
-              <w:t xml:space="preserve"> One screen will hold a 5-point mood scale, the 10 tags and an optional text box of up to 280 characters.</w:t>
+              <w:t xml:space="preserve"> One screen will hold a 5-point mood scale, the feeling and situation tags and an optional text box of up to 280 characters. The optional detail sheet opens over this screen, not as a new one.</w:t>
             </w:r>
           </w:p>
         </w:tc>

</xml_diff>

<commit_message>
Criterion B: plain tables, full technique names, no code or pixel clutter
Strip all shaded table cells from B.i and B.ii-B.iv, rename the twelve
coping techniques with plain names and explanations, replace scenario and
card codes with descriptive names, rewrite B.iv in a feature / function /
colour and font layout with the matching rules in plain words, and update
all 14 Canva boards to match.

Co-Authored-By: Claude Opus 5.5 <noreply@anthropic.com>
Claude-Session: https://claude.ai/code/session_01N8ZMe6NZXwEKHr9Mfg4w8L
</commit_message>
<xml_diff>
--- a/criterion-b/Criterion_B_i_Design_Specifications_v3.docx
+++ b/criterion-b/Criterion_B_i_Design_Specifications_v3.docx
@@ -12,7 +12,7 @@
           <w:rFonts w:ascii="Arial" w:cs="Arial" w:eastAsia="Arial" w:hAnsi="Arial"/>
           <w:b/>
           <w:bCs/>
-          <w:color w:val="1F4E5F"/>
+          <w:color w:val="1B1B1B"/>
           <w:sz w:val="32"/>
           <w:szCs w:val="32"/>
         </w:rPr>
@@ -30,7 +30,7 @@
           <w:rFonts w:ascii="Arial" w:cs="Arial" w:eastAsia="Arial" w:hAnsi="Arial"/>
           <w:b/>
           <w:bCs/>
-          <w:color w:val="1F4E5F"/>
+          <w:color w:val="1B1B1B"/>
           <w:sz w:val="24"/>
           <w:szCs w:val="24"/>
         </w:rPr>
@@ -67,12 +67,12 @@
       <w:tblPr>
         <w:tblW w:type="dxa" w:w="10512"/>
         <w:tblBorders>
-          <w:top w:val="single" w:color="auto" w:sz="4"/>
-          <w:left w:val="single" w:color="auto" w:sz="4"/>
-          <w:bottom w:val="single" w:color="auto" w:sz="4"/>
-          <w:right w:val="single" w:color="auto" w:sz="4"/>
-          <w:insideH w:val="single" w:color="auto" w:sz="4"/>
-          <w:insideV w:val="single" w:color="auto" w:sz="4"/>
+          <w:top w:val="single" w:color="8C8C8C" w:sz="4"/>
+          <w:left w:val="single" w:color="8C8C8C" w:sz="4"/>
+          <w:bottom w:val="single" w:color="8C8C8C" w:sz="4"/>
+          <w:right w:val="single" w:color="8C8C8C" w:sz="4"/>
+          <w:insideH w:val="single" w:color="8C8C8C" w:sz="4"/>
+          <w:insideV w:val="single" w:color="8C8C8C" w:sz="4"/>
         </w:tblBorders>
       </w:tblPr>
       <w:tblGrid>
@@ -91,26 +91,25 @@
           <w:tcPr>
             <w:tcW w:type="dxa" w:w="1500"/>
             <w:tcBorders>
-              <w:top w:val="single" w:color="8FA3AA" w:sz="4"/>
-              <w:left w:val="single" w:color="8FA3AA" w:sz="4"/>
-              <w:bottom w:val="single" w:color="8FA3AA" w:sz="4"/>
-              <w:right w:val="single" w:color="8FA3AA" w:sz="4"/>
-            </w:tcBorders>
-            <w:shd w:fill="1F4E5F" w:color="auto" w:val="clear"/>
-            <w:tcMar>
-              <w:top w:type="dxa" w:w="70"/>
-              <w:left w:type="dxa" w:w="90"/>
-              <w:bottom w:type="dxa" w:w="70"/>
-              <w:right w:type="dxa" w:w="90"/>
-            </w:tcMar>
-          </w:tcPr>
-          <w:p>
-            <w:r>
-              <w:rPr>
-                <w:rFonts w:ascii="Arial" w:cs="Arial" w:eastAsia="Arial" w:hAnsi="Arial"/>
-                <w:b/>
-                <w:bCs/>
-                <w:color w:val="FFFFFF"/>
+              <w:top w:val="single" w:color="8C8C8C" w:sz="4"/>
+              <w:left w:val="single" w:color="8C8C8C" w:sz="4"/>
+              <w:bottom w:val="single" w:color="8C8C8C" w:sz="4"/>
+              <w:right w:val="single" w:color="8C8C8C" w:sz="4"/>
+            </w:tcBorders>
+            <w:tcMar>
+              <w:top w:type="dxa" w:w="70"/>
+              <w:left w:type="dxa" w:w="90"/>
+              <w:bottom w:type="dxa" w:w="70"/>
+              <w:right w:type="dxa" w:w="90"/>
+            </w:tcMar>
+          </w:tcPr>
+          <w:p>
+            <w:r>
+              <w:rPr>
+                <w:rFonts w:ascii="Arial" w:cs="Arial" w:eastAsia="Arial" w:hAnsi="Arial"/>
+                <w:b/>
+                <w:bCs/>
+                <w:color w:val="1B1B1B"/>
                 <w:sz w:val="18"/>
                 <w:szCs w:val="18"/>
               </w:rPr>
@@ -122,26 +121,25 @@
           <w:tcPr>
             <w:tcW w:type="dxa" w:w="1880"/>
             <w:tcBorders>
-              <w:top w:val="single" w:color="8FA3AA" w:sz="4"/>
-              <w:left w:val="single" w:color="8FA3AA" w:sz="4"/>
-              <w:bottom w:val="single" w:color="8FA3AA" w:sz="4"/>
-              <w:right w:val="single" w:color="8FA3AA" w:sz="4"/>
-            </w:tcBorders>
-            <w:shd w:fill="1F4E5F" w:color="auto" w:val="clear"/>
-            <w:tcMar>
-              <w:top w:type="dxa" w:w="70"/>
-              <w:left w:type="dxa" w:w="90"/>
-              <w:bottom w:type="dxa" w:w="70"/>
-              <w:right w:type="dxa" w:w="90"/>
-            </w:tcMar>
-          </w:tcPr>
-          <w:p>
-            <w:r>
-              <w:rPr>
-                <w:rFonts w:ascii="Arial" w:cs="Arial" w:eastAsia="Arial" w:hAnsi="Arial"/>
-                <w:b/>
-                <w:bCs/>
-                <w:color w:val="FFFFFF"/>
+              <w:top w:val="single" w:color="8C8C8C" w:sz="4"/>
+              <w:left w:val="single" w:color="8C8C8C" w:sz="4"/>
+              <w:bottom w:val="single" w:color="8C8C8C" w:sz="4"/>
+              <w:right w:val="single" w:color="8C8C8C" w:sz="4"/>
+            </w:tcBorders>
+            <w:tcMar>
+              <w:top w:type="dxa" w:w="70"/>
+              <w:left w:type="dxa" w:w="90"/>
+              <w:bottom w:type="dxa" w:w="70"/>
+              <w:right w:type="dxa" w:w="90"/>
+            </w:tcMar>
+          </w:tcPr>
+          <w:p>
+            <w:r>
+              <w:rPr>
+                <w:rFonts w:ascii="Arial" w:cs="Arial" w:eastAsia="Arial" w:hAnsi="Arial"/>
+                <w:b/>
+                <w:bCs/>
+                <w:color w:val="1B1B1B"/>
                 <w:sz w:val="18"/>
                 <w:szCs w:val="18"/>
               </w:rPr>
@@ -153,26 +151,25 @@
           <w:tcPr>
             <w:tcW w:type="dxa" w:w="2280"/>
             <w:tcBorders>
-              <w:top w:val="single" w:color="8FA3AA" w:sz="4"/>
-              <w:left w:val="single" w:color="8FA3AA" w:sz="4"/>
-              <w:bottom w:val="single" w:color="8FA3AA" w:sz="4"/>
-              <w:right w:val="single" w:color="8FA3AA" w:sz="4"/>
-            </w:tcBorders>
-            <w:shd w:fill="1F4E5F" w:color="auto" w:val="clear"/>
-            <w:tcMar>
-              <w:top w:type="dxa" w:w="70"/>
-              <w:left w:type="dxa" w:w="90"/>
-              <w:bottom w:type="dxa" w:w="70"/>
-              <w:right w:type="dxa" w:w="90"/>
-            </w:tcMar>
-          </w:tcPr>
-          <w:p>
-            <w:r>
-              <w:rPr>
-                <w:rFonts w:ascii="Arial" w:cs="Arial" w:eastAsia="Arial" w:hAnsi="Arial"/>
-                <w:b/>
-                <w:bCs/>
-                <w:color w:val="FFFFFF"/>
+              <w:top w:val="single" w:color="8C8C8C" w:sz="4"/>
+              <w:left w:val="single" w:color="8C8C8C" w:sz="4"/>
+              <w:bottom w:val="single" w:color="8C8C8C" w:sz="4"/>
+              <w:right w:val="single" w:color="8C8C8C" w:sz="4"/>
+            </w:tcBorders>
+            <w:tcMar>
+              <w:top w:type="dxa" w:w="70"/>
+              <w:left w:type="dxa" w:w="90"/>
+              <w:bottom w:type="dxa" w:w="70"/>
+              <w:right w:type="dxa" w:w="90"/>
+            </w:tcMar>
+          </w:tcPr>
+          <w:p>
+            <w:r>
+              <w:rPr>
+                <w:rFonts w:ascii="Arial" w:cs="Arial" w:eastAsia="Arial" w:hAnsi="Arial"/>
+                <w:b/>
+                <w:bCs/>
+                <w:color w:val="1B1B1B"/>
                 <w:sz w:val="18"/>
                 <w:szCs w:val="18"/>
               </w:rPr>
@@ -184,26 +181,25 @@
           <w:tcPr>
             <w:tcW w:type="dxa" w:w="2550"/>
             <w:tcBorders>
-              <w:top w:val="single" w:color="8FA3AA" w:sz="4"/>
-              <w:left w:val="single" w:color="8FA3AA" w:sz="4"/>
-              <w:bottom w:val="single" w:color="8FA3AA" w:sz="4"/>
-              <w:right w:val="single" w:color="8FA3AA" w:sz="4"/>
-            </w:tcBorders>
-            <w:shd w:fill="1F4E5F" w:color="auto" w:val="clear"/>
-            <w:tcMar>
-              <w:top w:type="dxa" w:w="70"/>
-              <w:left w:type="dxa" w:w="90"/>
-              <w:bottom w:type="dxa" w:w="70"/>
-              <w:right w:type="dxa" w:w="90"/>
-            </w:tcMar>
-          </w:tcPr>
-          <w:p>
-            <w:r>
-              <w:rPr>
-                <w:rFonts w:ascii="Arial" w:cs="Arial" w:eastAsia="Arial" w:hAnsi="Arial"/>
-                <w:b/>
-                <w:bCs/>
-                <w:color w:val="FFFFFF"/>
+              <w:top w:val="single" w:color="8C8C8C" w:sz="4"/>
+              <w:left w:val="single" w:color="8C8C8C" w:sz="4"/>
+              <w:bottom w:val="single" w:color="8C8C8C" w:sz="4"/>
+              <w:right w:val="single" w:color="8C8C8C" w:sz="4"/>
+            </w:tcBorders>
+            <w:tcMar>
+              <w:top w:type="dxa" w:w="70"/>
+              <w:left w:type="dxa" w:w="90"/>
+              <w:bottom w:type="dxa" w:w="70"/>
+              <w:right w:type="dxa" w:w="90"/>
+            </w:tcMar>
+          </w:tcPr>
+          <w:p>
+            <w:r>
+              <w:rPr>
+                <w:rFonts w:ascii="Arial" w:cs="Arial" w:eastAsia="Arial" w:hAnsi="Arial"/>
+                <w:b/>
+                <w:bCs/>
+                <w:color w:val="1B1B1B"/>
                 <w:sz w:val="18"/>
                 <w:szCs w:val="18"/>
               </w:rPr>
@@ -215,26 +211,25 @@
           <w:tcPr>
             <w:tcW w:type="dxa" w:w="2302"/>
             <w:tcBorders>
-              <w:top w:val="single" w:color="8FA3AA" w:sz="4"/>
-              <w:left w:val="single" w:color="8FA3AA" w:sz="4"/>
-              <w:bottom w:val="single" w:color="8FA3AA" w:sz="4"/>
-              <w:right w:val="single" w:color="8FA3AA" w:sz="4"/>
-            </w:tcBorders>
-            <w:shd w:fill="1F4E5F" w:color="auto" w:val="clear"/>
-            <w:tcMar>
-              <w:top w:type="dxa" w:w="70"/>
-              <w:left w:type="dxa" w:w="90"/>
-              <w:bottom w:type="dxa" w:w="70"/>
-              <w:right w:type="dxa" w:w="90"/>
-            </w:tcMar>
-          </w:tcPr>
-          <w:p>
-            <w:r>
-              <w:rPr>
-                <w:rFonts w:ascii="Arial" w:cs="Arial" w:eastAsia="Arial" w:hAnsi="Arial"/>
-                <w:b/>
-                <w:bCs/>
-                <w:color w:val="FFFFFF"/>
+              <w:top w:val="single" w:color="8C8C8C" w:sz="4"/>
+              <w:left w:val="single" w:color="8C8C8C" w:sz="4"/>
+              <w:bottom w:val="single" w:color="8C8C8C" w:sz="4"/>
+              <w:right w:val="single" w:color="8C8C8C" w:sz="4"/>
+            </w:tcBorders>
+            <w:tcMar>
+              <w:top w:type="dxa" w:w="70"/>
+              <w:left w:type="dxa" w:w="90"/>
+              <w:bottom w:type="dxa" w:w="70"/>
+              <w:right w:type="dxa" w:w="90"/>
+            </w:tcMar>
+          </w:tcPr>
+          <w:p>
+            <w:r>
+              <w:rPr>
+                <w:rFonts w:ascii="Arial" w:cs="Arial" w:eastAsia="Arial" w:hAnsi="Arial"/>
+                <w:b/>
+                <w:bCs/>
+                <w:color w:val="1B1B1B"/>
                 <w:sz w:val="18"/>
                 <w:szCs w:val="18"/>
               </w:rPr>
@@ -251,26 +246,25 @@
           <w:tcPr>
             <w:tcW w:type="dxa" w:w="1500"/>
             <w:tcBorders>
-              <w:top w:val="single" w:color="8FA3AA" w:sz="4"/>
-              <w:left w:val="single" w:color="8FA3AA" w:sz="4"/>
-              <w:bottom w:val="single" w:color="8FA3AA" w:sz="4"/>
-              <w:right w:val="single" w:color="8FA3AA" w:sz="4"/>
-            </w:tcBorders>
-            <w:shd w:fill="1F4E5F" w:color="auto" w:val="clear"/>
-            <w:tcMar>
-              <w:top w:type="dxa" w:w="70"/>
-              <w:left w:type="dxa" w:w="90"/>
-              <w:bottom w:type="dxa" w:w="70"/>
-              <w:right w:type="dxa" w:w="90"/>
-            </w:tcMar>
-          </w:tcPr>
-          <w:p>
-            <w:r>
-              <w:rPr>
-                <w:rFonts w:ascii="Arial" w:cs="Arial" w:eastAsia="Arial" w:hAnsi="Arial"/>
-                <w:b/>
-                <w:bCs/>
-                <w:color w:val="FFFFFF"/>
+              <w:top w:val="single" w:color="8C8C8C" w:sz="4"/>
+              <w:left w:val="single" w:color="8C8C8C" w:sz="4"/>
+              <w:bottom w:val="single" w:color="8C8C8C" w:sz="4"/>
+              <w:right w:val="single" w:color="8C8C8C" w:sz="4"/>
+            </w:tcBorders>
+            <w:tcMar>
+              <w:top w:type="dxa" w:w="70"/>
+              <w:left w:type="dxa" w:w="90"/>
+              <w:bottom w:type="dxa" w:w="70"/>
+              <w:right w:type="dxa" w:w="90"/>
+            </w:tcMar>
+          </w:tcPr>
+          <w:p>
+            <w:r>
+              <w:rPr>
+                <w:rFonts w:ascii="Arial" w:cs="Arial" w:eastAsia="Arial" w:hAnsi="Arial"/>
+                <w:b/>
+                <w:bCs/>
+                <w:color w:val="1B1B1B"/>
                 <w:sz w:val="18"/>
                 <w:szCs w:val="18"/>
               </w:rPr>
@@ -282,10 +276,10 @@
           <w:tcPr>
             <w:tcW w:type="dxa" w:w="1880"/>
             <w:tcBorders>
-              <w:top w:val="single" w:color="8FA3AA" w:sz="4"/>
-              <w:left w:val="single" w:color="8FA3AA" w:sz="4"/>
-              <w:bottom w:val="single" w:color="8FA3AA" w:sz="4"/>
-              <w:right w:val="single" w:color="8FA3AA" w:sz="4"/>
+              <w:top w:val="single" w:color="8C8C8C" w:sz="4"/>
+              <w:left w:val="single" w:color="8C8C8C" w:sz="4"/>
+              <w:bottom w:val="single" w:color="8C8C8C" w:sz="4"/>
+              <w:right w:val="single" w:color="8C8C8C" w:sz="4"/>
             </w:tcBorders>
             <w:tcMar>
               <w:top w:type="dxa" w:w="70"/>
@@ -322,10 +316,10 @@
           <w:tcPr>
             <w:tcW w:type="dxa" w:w="2280"/>
             <w:tcBorders>
-              <w:top w:val="single" w:color="8FA3AA" w:sz="4"/>
-              <w:left w:val="single" w:color="8FA3AA" w:sz="4"/>
-              <w:bottom w:val="single" w:color="8FA3AA" w:sz="4"/>
-              <w:right w:val="single" w:color="8FA3AA" w:sz="4"/>
+              <w:top w:val="single" w:color="8C8C8C" w:sz="4"/>
+              <w:left w:val="single" w:color="8C8C8C" w:sz="4"/>
+              <w:bottom w:val="single" w:color="8C8C8C" w:sz="4"/>
+              <w:right w:val="single" w:color="8C8C8C" w:sz="4"/>
             </w:tcBorders>
             <w:tcMar>
               <w:top w:type="dxa" w:w="70"/>
@@ -365,10 +359,10 @@
           <w:tcPr>
             <w:tcW w:type="dxa" w:w="2550"/>
             <w:tcBorders>
-              <w:top w:val="single" w:color="8FA3AA" w:sz="4"/>
-              <w:left w:val="single" w:color="8FA3AA" w:sz="4"/>
-              <w:bottom w:val="single" w:color="8FA3AA" w:sz="4"/>
-              <w:right w:val="single" w:color="8FA3AA" w:sz="4"/>
+              <w:top w:val="single" w:color="8C8C8C" w:sz="4"/>
+              <w:left w:val="single" w:color="8C8C8C" w:sz="4"/>
+              <w:bottom w:val="single" w:color="8C8C8C" w:sz="4"/>
+              <w:right w:val="single" w:color="8C8C8C" w:sz="4"/>
             </w:tcBorders>
             <w:tcMar>
               <w:top w:type="dxa" w:w="70"/>
@@ -408,10 +402,10 @@
           <w:tcPr>
             <w:tcW w:type="dxa" w:w="2302"/>
             <w:tcBorders>
-              <w:top w:val="single" w:color="8FA3AA" w:sz="4"/>
-              <w:left w:val="single" w:color="8FA3AA" w:sz="4"/>
-              <w:bottom w:val="single" w:color="8FA3AA" w:sz="4"/>
-              <w:right w:val="single" w:color="8FA3AA" w:sz="4"/>
+              <w:top w:val="single" w:color="8C8C8C" w:sz="4"/>
+              <w:left w:val="single" w:color="8C8C8C" w:sz="4"/>
+              <w:bottom w:val="single" w:color="8C8C8C" w:sz="4"/>
+              <w:right w:val="single" w:color="8C8C8C" w:sz="4"/>
             </w:tcBorders>
             <w:tcMar>
               <w:top w:type="dxa" w:w="70"/>
@@ -522,26 +516,25 @@
           <w:tcPr>
             <w:tcW w:type="dxa" w:w="1500"/>
             <w:tcBorders>
-              <w:top w:val="single" w:color="8FA3AA" w:sz="4"/>
-              <w:left w:val="single" w:color="8FA3AA" w:sz="4"/>
-              <w:bottom w:val="single" w:color="8FA3AA" w:sz="4"/>
-              <w:right w:val="single" w:color="8FA3AA" w:sz="4"/>
-            </w:tcBorders>
-            <w:shd w:fill="1F4E5F" w:color="auto" w:val="clear"/>
-            <w:tcMar>
-              <w:top w:type="dxa" w:w="70"/>
-              <w:left w:type="dxa" w:w="90"/>
-              <w:bottom w:type="dxa" w:w="70"/>
-              <w:right w:type="dxa" w:w="90"/>
-            </w:tcMar>
-          </w:tcPr>
-          <w:p>
-            <w:r>
-              <w:rPr>
-                <w:rFonts w:ascii="Arial" w:cs="Arial" w:eastAsia="Arial" w:hAnsi="Arial"/>
-                <w:b/>
-                <w:bCs/>
-                <w:color w:val="FFFFFF"/>
+              <w:top w:val="single" w:color="8C8C8C" w:sz="4"/>
+              <w:left w:val="single" w:color="8C8C8C" w:sz="4"/>
+              <w:bottom w:val="single" w:color="8C8C8C" w:sz="4"/>
+              <w:right w:val="single" w:color="8C8C8C" w:sz="4"/>
+            </w:tcBorders>
+            <w:tcMar>
+              <w:top w:type="dxa" w:w="70"/>
+              <w:left w:type="dxa" w:w="90"/>
+              <w:bottom w:type="dxa" w:w="70"/>
+              <w:right w:type="dxa" w:w="90"/>
+            </w:tcMar>
+          </w:tcPr>
+          <w:p>
+            <w:r>
+              <w:rPr>
+                <w:rFonts w:ascii="Arial" w:cs="Arial" w:eastAsia="Arial" w:hAnsi="Arial"/>
+                <w:b/>
+                <w:bCs/>
+                <w:color w:val="1B1B1B"/>
                 <w:sz w:val="18"/>
                 <w:szCs w:val="18"/>
               </w:rPr>
@@ -553,10 +546,10 @@
           <w:tcPr>
             <w:tcW w:type="dxa" w:w="1880"/>
             <w:tcBorders>
-              <w:top w:val="single" w:color="8FA3AA" w:sz="4"/>
-              <w:left w:val="single" w:color="8FA3AA" w:sz="4"/>
-              <w:bottom w:val="single" w:color="8FA3AA" w:sz="4"/>
-              <w:right w:val="single" w:color="8FA3AA" w:sz="4"/>
+              <w:top w:val="single" w:color="8C8C8C" w:sz="4"/>
+              <w:left w:val="single" w:color="8C8C8C" w:sz="4"/>
+              <w:bottom w:val="single" w:color="8C8C8C" w:sz="4"/>
+              <w:right w:val="single" w:color="8C8C8C" w:sz="4"/>
             </w:tcBorders>
             <w:tcMar>
               <w:top w:type="dxa" w:w="70"/>
@@ -593,10 +586,10 @@
           <w:tcPr>
             <w:tcW w:type="dxa" w:w="2280"/>
             <w:tcBorders>
-              <w:top w:val="single" w:color="8FA3AA" w:sz="4"/>
-              <w:left w:val="single" w:color="8FA3AA" w:sz="4"/>
-              <w:bottom w:val="single" w:color="8FA3AA" w:sz="4"/>
-              <w:right w:val="single" w:color="8FA3AA" w:sz="4"/>
+              <w:top w:val="single" w:color="8C8C8C" w:sz="4"/>
+              <w:left w:val="single" w:color="8C8C8C" w:sz="4"/>
+              <w:bottom w:val="single" w:color="8C8C8C" w:sz="4"/>
+              <w:right w:val="single" w:color="8C8C8C" w:sz="4"/>
             </w:tcBorders>
             <w:tcMar>
               <w:top w:type="dxa" w:w="70"/>
@@ -623,10 +616,10 @@
           <w:tcPr>
             <w:tcW w:type="dxa" w:w="2550"/>
             <w:tcBorders>
-              <w:top w:val="single" w:color="8FA3AA" w:sz="4"/>
-              <w:left w:val="single" w:color="8FA3AA" w:sz="4"/>
-              <w:bottom w:val="single" w:color="8FA3AA" w:sz="4"/>
-              <w:right w:val="single" w:color="8FA3AA" w:sz="4"/>
+              <w:top w:val="single" w:color="8C8C8C" w:sz="4"/>
+              <w:left w:val="single" w:color="8C8C8C" w:sz="4"/>
+              <w:bottom w:val="single" w:color="8C8C8C" w:sz="4"/>
+              <w:right w:val="single" w:color="8C8C8C" w:sz="4"/>
             </w:tcBorders>
             <w:tcMar>
               <w:top w:type="dxa" w:w="70"/>
@@ -666,10 +659,10 @@
           <w:tcPr>
             <w:tcW w:type="dxa" w:w="2302"/>
             <w:tcBorders>
-              <w:top w:val="single" w:color="8FA3AA" w:sz="4"/>
-              <w:left w:val="single" w:color="8FA3AA" w:sz="4"/>
-              <w:bottom w:val="single" w:color="8FA3AA" w:sz="4"/>
-              <w:right w:val="single" w:color="8FA3AA" w:sz="4"/>
+              <w:top w:val="single" w:color="8C8C8C" w:sz="4"/>
+              <w:left w:val="single" w:color="8C8C8C" w:sz="4"/>
+              <w:bottom w:val="single" w:color="8C8C8C" w:sz="4"/>
+              <w:right w:val="single" w:color="8C8C8C" w:sz="4"/>
             </w:tcBorders>
             <w:tcMar>
               <w:top w:type="dxa" w:w="70"/>
@@ -780,26 +773,25 @@
           <w:tcPr>
             <w:tcW w:type="dxa" w:w="1500"/>
             <w:tcBorders>
-              <w:top w:val="single" w:color="8FA3AA" w:sz="4"/>
-              <w:left w:val="single" w:color="8FA3AA" w:sz="4"/>
-              <w:bottom w:val="single" w:color="8FA3AA" w:sz="4"/>
-              <w:right w:val="single" w:color="8FA3AA" w:sz="4"/>
-            </w:tcBorders>
-            <w:shd w:fill="1F4E5F" w:color="auto" w:val="clear"/>
-            <w:tcMar>
-              <w:top w:type="dxa" w:w="70"/>
-              <w:left w:type="dxa" w:w="90"/>
-              <w:bottom w:type="dxa" w:w="70"/>
-              <w:right w:type="dxa" w:w="90"/>
-            </w:tcMar>
-          </w:tcPr>
-          <w:p>
-            <w:r>
-              <w:rPr>
-                <w:rFonts w:ascii="Arial" w:cs="Arial" w:eastAsia="Arial" w:hAnsi="Arial"/>
-                <w:b/>
-                <w:bCs/>
-                <w:color w:val="FFFFFF"/>
+              <w:top w:val="single" w:color="8C8C8C" w:sz="4"/>
+              <w:left w:val="single" w:color="8C8C8C" w:sz="4"/>
+              <w:bottom w:val="single" w:color="8C8C8C" w:sz="4"/>
+              <w:right w:val="single" w:color="8C8C8C" w:sz="4"/>
+            </w:tcBorders>
+            <w:tcMar>
+              <w:top w:type="dxa" w:w="70"/>
+              <w:left w:type="dxa" w:w="90"/>
+              <w:bottom w:type="dxa" w:w="70"/>
+              <w:right w:type="dxa" w:w="90"/>
+            </w:tcMar>
+          </w:tcPr>
+          <w:p>
+            <w:r>
+              <w:rPr>
+                <w:rFonts w:ascii="Arial" w:cs="Arial" w:eastAsia="Arial" w:hAnsi="Arial"/>
+                <w:b/>
+                <w:bCs/>
+                <w:color w:val="1B1B1B"/>
                 <w:sz w:val="18"/>
                 <w:szCs w:val="18"/>
               </w:rPr>
@@ -811,10 +803,10 @@
           <w:tcPr>
             <w:tcW w:type="dxa" w:w="1880"/>
             <w:tcBorders>
-              <w:top w:val="single" w:color="8FA3AA" w:sz="4"/>
-              <w:left w:val="single" w:color="8FA3AA" w:sz="4"/>
-              <w:bottom w:val="single" w:color="8FA3AA" w:sz="4"/>
-              <w:right w:val="single" w:color="8FA3AA" w:sz="4"/>
+              <w:top w:val="single" w:color="8C8C8C" w:sz="4"/>
+              <w:left w:val="single" w:color="8C8C8C" w:sz="4"/>
+              <w:bottom w:val="single" w:color="8C8C8C" w:sz="4"/>
+              <w:right w:val="single" w:color="8C8C8C" w:sz="4"/>
             </w:tcBorders>
             <w:tcMar>
               <w:top w:type="dxa" w:w="70"/>
@@ -851,10 +843,10 @@
           <w:tcPr>
             <w:tcW w:type="dxa" w:w="2280"/>
             <w:tcBorders>
-              <w:top w:val="single" w:color="8FA3AA" w:sz="4"/>
-              <w:left w:val="single" w:color="8FA3AA" w:sz="4"/>
-              <w:bottom w:val="single" w:color="8FA3AA" w:sz="4"/>
-              <w:right w:val="single" w:color="8FA3AA" w:sz="4"/>
+              <w:top w:val="single" w:color="8C8C8C" w:sz="4"/>
+              <w:left w:val="single" w:color="8C8C8C" w:sz="4"/>
+              <w:bottom w:val="single" w:color="8C8C8C" w:sz="4"/>
+              <w:right w:val="single" w:color="8C8C8C" w:sz="4"/>
             </w:tcBorders>
             <w:tcMar>
               <w:top w:type="dxa" w:w="70"/>
@@ -894,10 +886,10 @@
           <w:tcPr>
             <w:tcW w:type="dxa" w:w="2550"/>
             <w:tcBorders>
-              <w:top w:val="single" w:color="8FA3AA" w:sz="4"/>
-              <w:left w:val="single" w:color="8FA3AA" w:sz="4"/>
-              <w:bottom w:val="single" w:color="8FA3AA" w:sz="4"/>
-              <w:right w:val="single" w:color="8FA3AA" w:sz="4"/>
+              <w:top w:val="single" w:color="8C8C8C" w:sz="4"/>
+              <w:left w:val="single" w:color="8C8C8C" w:sz="4"/>
+              <w:bottom w:val="single" w:color="8C8C8C" w:sz="4"/>
+              <w:right w:val="single" w:color="8C8C8C" w:sz="4"/>
             </w:tcBorders>
             <w:tcMar>
               <w:top w:type="dxa" w:w="70"/>
@@ -937,10 +929,10 @@
           <w:tcPr>
             <w:tcW w:type="dxa" w:w="2302"/>
             <w:tcBorders>
-              <w:top w:val="single" w:color="8FA3AA" w:sz="4"/>
-              <w:left w:val="single" w:color="8FA3AA" w:sz="4"/>
-              <w:bottom w:val="single" w:color="8FA3AA" w:sz="4"/>
-              <w:right w:val="single" w:color="8FA3AA" w:sz="4"/>
+              <w:top w:val="single" w:color="8C8C8C" w:sz="4"/>
+              <w:left w:val="single" w:color="8C8C8C" w:sz="4"/>
+              <w:bottom w:val="single" w:color="8C8C8C" w:sz="4"/>
+              <w:right w:val="single" w:color="8C8C8C" w:sz="4"/>
             </w:tcBorders>
             <w:tcMar>
               <w:top w:type="dxa" w:w="70"/>
@@ -1051,26 +1043,25 @@
           <w:tcPr>
             <w:tcW w:type="dxa" w:w="1500"/>
             <w:tcBorders>
-              <w:top w:val="single" w:color="8FA3AA" w:sz="4"/>
-              <w:left w:val="single" w:color="8FA3AA" w:sz="4"/>
-              <w:bottom w:val="single" w:color="8FA3AA" w:sz="4"/>
-              <w:right w:val="single" w:color="8FA3AA" w:sz="4"/>
-            </w:tcBorders>
-            <w:shd w:fill="1F4E5F" w:color="auto" w:val="clear"/>
-            <w:tcMar>
-              <w:top w:type="dxa" w:w="70"/>
-              <w:left w:type="dxa" w:w="90"/>
-              <w:bottom w:type="dxa" w:w="70"/>
-              <w:right w:type="dxa" w:w="90"/>
-            </w:tcMar>
-          </w:tcPr>
-          <w:p>
-            <w:r>
-              <w:rPr>
-                <w:rFonts w:ascii="Arial" w:cs="Arial" w:eastAsia="Arial" w:hAnsi="Arial"/>
-                <w:b/>
-                <w:bCs/>
-                <w:color w:val="FFFFFF"/>
+              <w:top w:val="single" w:color="8C8C8C" w:sz="4"/>
+              <w:left w:val="single" w:color="8C8C8C" w:sz="4"/>
+              <w:bottom w:val="single" w:color="8C8C8C" w:sz="4"/>
+              <w:right w:val="single" w:color="8C8C8C" w:sz="4"/>
+            </w:tcBorders>
+            <w:tcMar>
+              <w:top w:type="dxa" w:w="70"/>
+              <w:left w:type="dxa" w:w="90"/>
+              <w:bottom w:type="dxa" w:w="70"/>
+              <w:right w:type="dxa" w:w="90"/>
+            </w:tcMar>
+          </w:tcPr>
+          <w:p>
+            <w:r>
+              <w:rPr>
+                <w:rFonts w:ascii="Arial" w:cs="Arial" w:eastAsia="Arial" w:hAnsi="Arial"/>
+                <w:b/>
+                <w:bCs/>
+                <w:color w:val="1B1B1B"/>
                 <w:sz w:val="18"/>
                 <w:szCs w:val="18"/>
               </w:rPr>
@@ -1082,10 +1073,10 @@
           <w:tcPr>
             <w:tcW w:type="dxa" w:w="1880"/>
             <w:tcBorders>
-              <w:top w:val="single" w:color="8FA3AA" w:sz="4"/>
-              <w:left w:val="single" w:color="8FA3AA" w:sz="4"/>
-              <w:bottom w:val="single" w:color="8FA3AA" w:sz="4"/>
-              <w:right w:val="single" w:color="8FA3AA" w:sz="4"/>
+              <w:top w:val="single" w:color="8C8C8C" w:sz="4"/>
+              <w:left w:val="single" w:color="8C8C8C" w:sz="4"/>
+              <w:bottom w:val="single" w:color="8C8C8C" w:sz="4"/>
+              <w:right w:val="single" w:color="8C8C8C" w:sz="4"/>
             </w:tcBorders>
             <w:tcMar>
               <w:top w:type="dxa" w:w="70"/>
@@ -1122,10 +1113,10 @@
           <w:tcPr>
             <w:tcW w:type="dxa" w:w="2280"/>
             <w:tcBorders>
-              <w:top w:val="single" w:color="8FA3AA" w:sz="4"/>
-              <w:left w:val="single" w:color="8FA3AA" w:sz="4"/>
-              <w:bottom w:val="single" w:color="8FA3AA" w:sz="4"/>
-              <w:right w:val="single" w:color="8FA3AA" w:sz="4"/>
+              <w:top w:val="single" w:color="8C8C8C" w:sz="4"/>
+              <w:left w:val="single" w:color="8C8C8C" w:sz="4"/>
+              <w:bottom w:val="single" w:color="8C8C8C" w:sz="4"/>
+              <w:right w:val="single" w:color="8C8C8C" w:sz="4"/>
             </w:tcBorders>
             <w:tcMar>
               <w:top w:type="dxa" w:w="70"/>
@@ -1165,10 +1156,10 @@
           <w:tcPr>
             <w:tcW w:type="dxa" w:w="2550"/>
             <w:tcBorders>
-              <w:top w:val="single" w:color="8FA3AA" w:sz="4"/>
-              <w:left w:val="single" w:color="8FA3AA" w:sz="4"/>
-              <w:bottom w:val="single" w:color="8FA3AA" w:sz="4"/>
-              <w:right w:val="single" w:color="8FA3AA" w:sz="4"/>
+              <w:top w:val="single" w:color="8C8C8C" w:sz="4"/>
+              <w:left w:val="single" w:color="8C8C8C" w:sz="4"/>
+              <w:bottom w:val="single" w:color="8C8C8C" w:sz="4"/>
+              <w:right w:val="single" w:color="8C8C8C" w:sz="4"/>
             </w:tcBorders>
             <w:tcMar>
               <w:top w:type="dxa" w:w="70"/>
@@ -1221,10 +1212,10 @@
           <w:tcPr>
             <w:tcW w:type="dxa" w:w="2302"/>
             <w:tcBorders>
-              <w:top w:val="single" w:color="8FA3AA" w:sz="4"/>
-              <w:left w:val="single" w:color="8FA3AA" w:sz="4"/>
-              <w:bottom w:val="single" w:color="8FA3AA" w:sz="4"/>
-              <w:right w:val="single" w:color="8FA3AA" w:sz="4"/>
+              <w:top w:val="single" w:color="8C8C8C" w:sz="4"/>
+              <w:left w:val="single" w:color="8C8C8C" w:sz="4"/>
+              <w:bottom w:val="single" w:color="8C8C8C" w:sz="4"/>
+              <w:right w:val="single" w:color="8C8C8C" w:sz="4"/>
             </w:tcBorders>
             <w:tcMar>
               <w:top w:type="dxa" w:w="70"/>
@@ -1335,26 +1326,25 @@
           <w:tcPr>
             <w:tcW w:type="dxa" w:w="1500"/>
             <w:tcBorders>
-              <w:top w:val="single" w:color="8FA3AA" w:sz="4"/>
-              <w:left w:val="single" w:color="8FA3AA" w:sz="4"/>
-              <w:bottom w:val="single" w:color="8FA3AA" w:sz="4"/>
-              <w:right w:val="single" w:color="8FA3AA" w:sz="4"/>
-            </w:tcBorders>
-            <w:shd w:fill="1F4E5F" w:color="auto" w:val="clear"/>
-            <w:tcMar>
-              <w:top w:type="dxa" w:w="70"/>
-              <w:left w:type="dxa" w:w="90"/>
-              <w:bottom w:type="dxa" w:w="70"/>
-              <w:right w:type="dxa" w:w="90"/>
-            </w:tcMar>
-          </w:tcPr>
-          <w:p>
-            <w:r>
-              <w:rPr>
-                <w:rFonts w:ascii="Arial" w:cs="Arial" w:eastAsia="Arial" w:hAnsi="Arial"/>
-                <w:b/>
-                <w:bCs/>
-                <w:color w:val="FFFFFF"/>
+              <w:top w:val="single" w:color="8C8C8C" w:sz="4"/>
+              <w:left w:val="single" w:color="8C8C8C" w:sz="4"/>
+              <w:bottom w:val="single" w:color="8C8C8C" w:sz="4"/>
+              <w:right w:val="single" w:color="8C8C8C" w:sz="4"/>
+            </w:tcBorders>
+            <w:tcMar>
+              <w:top w:type="dxa" w:w="70"/>
+              <w:left w:type="dxa" w:w="90"/>
+              <w:bottom w:type="dxa" w:w="70"/>
+              <w:right w:type="dxa" w:w="90"/>
+            </w:tcMar>
+          </w:tcPr>
+          <w:p>
+            <w:r>
+              <w:rPr>
+                <w:rFonts w:ascii="Arial" w:cs="Arial" w:eastAsia="Arial" w:hAnsi="Arial"/>
+                <w:b/>
+                <w:bCs/>
+                <w:color w:val="1B1B1B"/>
                 <w:sz w:val="18"/>
                 <w:szCs w:val="18"/>
               </w:rPr>
@@ -1366,10 +1356,10 @@
           <w:tcPr>
             <w:tcW w:type="dxa" w:w="1880"/>
             <w:tcBorders>
-              <w:top w:val="single" w:color="8FA3AA" w:sz="4"/>
-              <w:left w:val="single" w:color="8FA3AA" w:sz="4"/>
-              <w:bottom w:val="single" w:color="8FA3AA" w:sz="4"/>
-              <w:right w:val="single" w:color="8FA3AA" w:sz="4"/>
+              <w:top w:val="single" w:color="8C8C8C" w:sz="4"/>
+              <w:left w:val="single" w:color="8C8C8C" w:sz="4"/>
+              <w:bottom w:val="single" w:color="8C8C8C" w:sz="4"/>
+              <w:right w:val="single" w:color="8C8C8C" w:sz="4"/>
             </w:tcBorders>
             <w:tcMar>
               <w:top w:type="dxa" w:w="70"/>
@@ -1406,10 +1396,10 @@
           <w:tcPr>
             <w:tcW w:type="dxa" w:w="2280"/>
             <w:tcBorders>
-              <w:top w:val="single" w:color="8FA3AA" w:sz="4"/>
-              <w:left w:val="single" w:color="8FA3AA" w:sz="4"/>
-              <w:bottom w:val="single" w:color="8FA3AA" w:sz="4"/>
-              <w:right w:val="single" w:color="8FA3AA" w:sz="4"/>
+              <w:top w:val="single" w:color="8C8C8C" w:sz="4"/>
+              <w:left w:val="single" w:color="8C8C8C" w:sz="4"/>
+              <w:bottom w:val="single" w:color="8C8C8C" w:sz="4"/>
+              <w:right w:val="single" w:color="8C8C8C" w:sz="4"/>
             </w:tcBorders>
             <w:tcMar>
               <w:top w:type="dxa" w:w="70"/>
@@ -1449,10 +1439,10 @@
           <w:tcPr>
             <w:tcW w:type="dxa" w:w="2550"/>
             <w:tcBorders>
-              <w:top w:val="single" w:color="8FA3AA" w:sz="4"/>
-              <w:left w:val="single" w:color="8FA3AA" w:sz="4"/>
-              <w:bottom w:val="single" w:color="8FA3AA" w:sz="4"/>
-              <w:right w:val="single" w:color="8FA3AA" w:sz="4"/>
+              <w:top w:val="single" w:color="8C8C8C" w:sz="4"/>
+              <w:left w:val="single" w:color="8C8C8C" w:sz="4"/>
+              <w:bottom w:val="single" w:color="8C8C8C" w:sz="4"/>
+              <w:right w:val="single" w:color="8C8C8C" w:sz="4"/>
             </w:tcBorders>
             <w:tcMar>
               <w:top w:type="dxa" w:w="70"/>
@@ -1492,10 +1482,10 @@
           <w:tcPr>
             <w:tcW w:type="dxa" w:w="2302"/>
             <w:tcBorders>
-              <w:top w:val="single" w:color="8FA3AA" w:sz="4"/>
-              <w:left w:val="single" w:color="8FA3AA" w:sz="4"/>
-              <w:bottom w:val="single" w:color="8FA3AA" w:sz="4"/>
-              <w:right w:val="single" w:color="8FA3AA" w:sz="4"/>
+              <w:top w:val="single" w:color="8C8C8C" w:sz="4"/>
+              <w:left w:val="single" w:color="8C8C8C" w:sz="4"/>
+              <w:bottom w:val="single" w:color="8C8C8C" w:sz="4"/>
+              <w:right w:val="single" w:color="8C8C8C" w:sz="4"/>
             </w:tcBorders>
             <w:tcMar>
               <w:top w:type="dxa" w:w="70"/>
@@ -1606,26 +1596,25 @@
           <w:tcPr>
             <w:tcW w:type="dxa" w:w="1500"/>
             <w:tcBorders>
-              <w:top w:val="single" w:color="8FA3AA" w:sz="4"/>
-              <w:left w:val="single" w:color="8FA3AA" w:sz="4"/>
-              <w:bottom w:val="single" w:color="8FA3AA" w:sz="4"/>
-              <w:right w:val="single" w:color="8FA3AA" w:sz="4"/>
-            </w:tcBorders>
-            <w:shd w:fill="1F4E5F" w:color="auto" w:val="clear"/>
-            <w:tcMar>
-              <w:top w:type="dxa" w:w="70"/>
-              <w:left w:type="dxa" w:w="90"/>
-              <w:bottom w:type="dxa" w:w="70"/>
-              <w:right w:type="dxa" w:w="90"/>
-            </w:tcMar>
-          </w:tcPr>
-          <w:p>
-            <w:r>
-              <w:rPr>
-                <w:rFonts w:ascii="Arial" w:cs="Arial" w:eastAsia="Arial" w:hAnsi="Arial"/>
-                <w:b/>
-                <w:bCs/>
-                <w:color w:val="FFFFFF"/>
+              <w:top w:val="single" w:color="8C8C8C" w:sz="4"/>
+              <w:left w:val="single" w:color="8C8C8C" w:sz="4"/>
+              <w:bottom w:val="single" w:color="8C8C8C" w:sz="4"/>
+              <w:right w:val="single" w:color="8C8C8C" w:sz="4"/>
+            </w:tcBorders>
+            <w:tcMar>
+              <w:top w:type="dxa" w:w="70"/>
+              <w:left w:type="dxa" w:w="90"/>
+              <w:bottom w:type="dxa" w:w="70"/>
+              <w:right w:type="dxa" w:w="90"/>
+            </w:tcMar>
+          </w:tcPr>
+          <w:p>
+            <w:r>
+              <w:rPr>
+                <w:rFonts w:ascii="Arial" w:cs="Arial" w:eastAsia="Arial" w:hAnsi="Arial"/>
+                <w:b/>
+                <w:bCs/>
+                <w:color w:val="1B1B1B"/>
                 <w:sz w:val="18"/>
                 <w:szCs w:val="18"/>
               </w:rPr>
@@ -1637,10 +1626,10 @@
           <w:tcPr>
             <w:tcW w:type="dxa" w:w="1880"/>
             <w:tcBorders>
-              <w:top w:val="single" w:color="8FA3AA" w:sz="4"/>
-              <w:left w:val="single" w:color="8FA3AA" w:sz="4"/>
-              <w:bottom w:val="single" w:color="8FA3AA" w:sz="4"/>
-              <w:right w:val="single" w:color="8FA3AA" w:sz="4"/>
+              <w:top w:val="single" w:color="8C8C8C" w:sz="4"/>
+              <w:left w:val="single" w:color="8C8C8C" w:sz="4"/>
+              <w:bottom w:val="single" w:color="8C8C8C" w:sz="4"/>
+              <w:right w:val="single" w:color="8C8C8C" w:sz="4"/>
             </w:tcBorders>
             <w:tcMar>
               <w:top w:type="dxa" w:w="70"/>
@@ -1677,10 +1666,10 @@
           <w:tcPr>
             <w:tcW w:type="dxa" w:w="2280"/>
             <w:tcBorders>
-              <w:top w:val="single" w:color="8FA3AA" w:sz="4"/>
-              <w:left w:val="single" w:color="8FA3AA" w:sz="4"/>
-              <w:bottom w:val="single" w:color="8FA3AA" w:sz="4"/>
-              <w:right w:val="single" w:color="8FA3AA" w:sz="4"/>
+              <w:top w:val="single" w:color="8C8C8C" w:sz="4"/>
+              <w:left w:val="single" w:color="8C8C8C" w:sz="4"/>
+              <w:bottom w:val="single" w:color="8C8C8C" w:sz="4"/>
+              <w:right w:val="single" w:color="8C8C8C" w:sz="4"/>
             </w:tcBorders>
             <w:tcMar>
               <w:top w:type="dxa" w:w="70"/>
@@ -1707,10 +1696,10 @@
           <w:tcPr>
             <w:tcW w:type="dxa" w:w="2550"/>
             <w:tcBorders>
-              <w:top w:val="single" w:color="8FA3AA" w:sz="4"/>
-              <w:left w:val="single" w:color="8FA3AA" w:sz="4"/>
-              <w:bottom w:val="single" w:color="8FA3AA" w:sz="4"/>
-              <w:right w:val="single" w:color="8FA3AA" w:sz="4"/>
+              <w:top w:val="single" w:color="8C8C8C" w:sz="4"/>
+              <w:left w:val="single" w:color="8C8C8C" w:sz="4"/>
+              <w:bottom w:val="single" w:color="8C8C8C" w:sz="4"/>
+              <w:right w:val="single" w:color="8C8C8C" w:sz="4"/>
             </w:tcBorders>
             <w:tcMar>
               <w:top w:type="dxa" w:w="70"/>
@@ -1750,10 +1739,10 @@
           <w:tcPr>
             <w:tcW w:type="dxa" w:w="2302"/>
             <w:tcBorders>
-              <w:top w:val="single" w:color="8FA3AA" w:sz="4"/>
-              <w:left w:val="single" w:color="8FA3AA" w:sz="4"/>
-              <w:bottom w:val="single" w:color="8FA3AA" w:sz="4"/>
-              <w:right w:val="single" w:color="8FA3AA" w:sz="4"/>
+              <w:top w:val="single" w:color="8C8C8C" w:sz="4"/>
+              <w:left w:val="single" w:color="8C8C8C" w:sz="4"/>
+              <w:bottom w:val="single" w:color="8C8C8C" w:sz="4"/>
+              <w:right w:val="single" w:color="8C8C8C" w:sz="4"/>
             </w:tcBorders>
             <w:tcMar>
               <w:top w:type="dxa" w:w="70"/>
@@ -1864,26 +1853,25 @@
           <w:tcPr>
             <w:tcW w:type="dxa" w:w="1500"/>
             <w:tcBorders>
-              <w:top w:val="single" w:color="8FA3AA" w:sz="4"/>
-              <w:left w:val="single" w:color="8FA3AA" w:sz="4"/>
-              <w:bottom w:val="single" w:color="8FA3AA" w:sz="4"/>
-              <w:right w:val="single" w:color="8FA3AA" w:sz="4"/>
-            </w:tcBorders>
-            <w:shd w:fill="1F4E5F" w:color="auto" w:val="clear"/>
-            <w:tcMar>
-              <w:top w:type="dxa" w:w="70"/>
-              <w:left w:type="dxa" w:w="90"/>
-              <w:bottom w:type="dxa" w:w="70"/>
-              <w:right w:type="dxa" w:w="90"/>
-            </w:tcMar>
-          </w:tcPr>
-          <w:p>
-            <w:r>
-              <w:rPr>
-                <w:rFonts w:ascii="Arial" w:cs="Arial" w:eastAsia="Arial" w:hAnsi="Arial"/>
-                <w:b/>
-                <w:bCs/>
-                <w:color w:val="FFFFFF"/>
+              <w:top w:val="single" w:color="8C8C8C" w:sz="4"/>
+              <w:left w:val="single" w:color="8C8C8C" w:sz="4"/>
+              <w:bottom w:val="single" w:color="8C8C8C" w:sz="4"/>
+              <w:right w:val="single" w:color="8C8C8C" w:sz="4"/>
+            </w:tcBorders>
+            <w:tcMar>
+              <w:top w:type="dxa" w:w="70"/>
+              <w:left w:type="dxa" w:w="90"/>
+              <w:bottom w:type="dxa" w:w="70"/>
+              <w:right w:type="dxa" w:w="90"/>
+            </w:tcMar>
+          </w:tcPr>
+          <w:p>
+            <w:r>
+              <w:rPr>
+                <w:rFonts w:ascii="Arial" w:cs="Arial" w:eastAsia="Arial" w:hAnsi="Arial"/>
+                <w:b/>
+                <w:bCs/>
+                <w:color w:val="1B1B1B"/>
                 <w:sz w:val="18"/>
                 <w:szCs w:val="18"/>
               </w:rPr>
@@ -1895,10 +1883,10 @@
           <w:tcPr>
             <w:tcW w:type="dxa" w:w="1880"/>
             <w:tcBorders>
-              <w:top w:val="single" w:color="8FA3AA" w:sz="4"/>
-              <w:left w:val="single" w:color="8FA3AA" w:sz="4"/>
-              <w:bottom w:val="single" w:color="8FA3AA" w:sz="4"/>
-              <w:right w:val="single" w:color="8FA3AA" w:sz="4"/>
+              <w:top w:val="single" w:color="8C8C8C" w:sz="4"/>
+              <w:left w:val="single" w:color="8C8C8C" w:sz="4"/>
+              <w:bottom w:val="single" w:color="8C8C8C" w:sz="4"/>
+              <w:right w:val="single" w:color="8C8C8C" w:sz="4"/>
             </w:tcBorders>
             <w:tcMar>
               <w:top w:type="dxa" w:w="70"/>
@@ -1935,10 +1923,10 @@
           <w:tcPr>
             <w:tcW w:type="dxa" w:w="2280"/>
             <w:tcBorders>
-              <w:top w:val="single" w:color="8FA3AA" w:sz="4"/>
-              <w:left w:val="single" w:color="8FA3AA" w:sz="4"/>
-              <w:bottom w:val="single" w:color="8FA3AA" w:sz="4"/>
-              <w:right w:val="single" w:color="8FA3AA" w:sz="4"/>
+              <w:top w:val="single" w:color="8C8C8C" w:sz="4"/>
+              <w:left w:val="single" w:color="8C8C8C" w:sz="4"/>
+              <w:bottom w:val="single" w:color="8C8C8C" w:sz="4"/>
+              <w:right w:val="single" w:color="8C8C8C" w:sz="4"/>
             </w:tcBorders>
             <w:tcMar>
               <w:top w:type="dxa" w:w="70"/>
@@ -1965,10 +1953,10 @@
           <w:tcPr>
             <w:tcW w:type="dxa" w:w="2550"/>
             <w:tcBorders>
-              <w:top w:val="single" w:color="8FA3AA" w:sz="4"/>
-              <w:left w:val="single" w:color="8FA3AA" w:sz="4"/>
-              <w:bottom w:val="single" w:color="8FA3AA" w:sz="4"/>
-              <w:right w:val="single" w:color="8FA3AA" w:sz="4"/>
+              <w:top w:val="single" w:color="8C8C8C" w:sz="4"/>
+              <w:left w:val="single" w:color="8C8C8C" w:sz="4"/>
+              <w:bottom w:val="single" w:color="8C8C8C" w:sz="4"/>
+              <w:right w:val="single" w:color="8C8C8C" w:sz="4"/>
             </w:tcBorders>
             <w:tcMar>
               <w:top w:type="dxa" w:w="70"/>
@@ -2008,10 +1996,10 @@
           <w:tcPr>
             <w:tcW w:type="dxa" w:w="2302"/>
             <w:tcBorders>
-              <w:top w:val="single" w:color="8FA3AA" w:sz="4"/>
-              <w:left w:val="single" w:color="8FA3AA" w:sz="4"/>
-              <w:bottom w:val="single" w:color="8FA3AA" w:sz="4"/>
-              <w:right w:val="single" w:color="8FA3AA" w:sz="4"/>
+              <w:top w:val="single" w:color="8C8C8C" w:sz="4"/>
+              <w:left w:val="single" w:color="8C8C8C" w:sz="4"/>
+              <w:bottom w:val="single" w:color="8C8C8C" w:sz="4"/>
+              <w:right w:val="single" w:color="8C8C8C" w:sz="4"/>
             </w:tcBorders>
             <w:tcMar>
               <w:top w:type="dxa" w:w="70"/>
@@ -2122,26 +2110,25 @@
           <w:tcPr>
             <w:tcW w:type="dxa" w:w="1500"/>
             <w:tcBorders>
-              <w:top w:val="single" w:color="8FA3AA" w:sz="4"/>
-              <w:left w:val="single" w:color="8FA3AA" w:sz="4"/>
-              <w:bottom w:val="single" w:color="8FA3AA" w:sz="4"/>
-              <w:right w:val="single" w:color="8FA3AA" w:sz="4"/>
-            </w:tcBorders>
-            <w:shd w:fill="1F4E5F" w:color="auto" w:val="clear"/>
-            <w:tcMar>
-              <w:top w:type="dxa" w:w="70"/>
-              <w:left w:type="dxa" w:w="90"/>
-              <w:bottom w:type="dxa" w:w="70"/>
-              <w:right w:type="dxa" w:w="90"/>
-            </w:tcMar>
-          </w:tcPr>
-          <w:p>
-            <w:r>
-              <w:rPr>
-                <w:rFonts w:ascii="Arial" w:cs="Arial" w:eastAsia="Arial" w:hAnsi="Arial"/>
-                <w:b/>
-                <w:bCs/>
-                <w:color w:val="FFFFFF"/>
+              <w:top w:val="single" w:color="8C8C8C" w:sz="4"/>
+              <w:left w:val="single" w:color="8C8C8C" w:sz="4"/>
+              <w:bottom w:val="single" w:color="8C8C8C" w:sz="4"/>
+              <w:right w:val="single" w:color="8C8C8C" w:sz="4"/>
+            </w:tcBorders>
+            <w:tcMar>
+              <w:top w:type="dxa" w:w="70"/>
+              <w:left w:type="dxa" w:w="90"/>
+              <w:bottom w:type="dxa" w:w="70"/>
+              <w:right w:type="dxa" w:w="90"/>
+            </w:tcMar>
+          </w:tcPr>
+          <w:p>
+            <w:r>
+              <w:rPr>
+                <w:rFonts w:ascii="Arial" w:cs="Arial" w:eastAsia="Arial" w:hAnsi="Arial"/>
+                <w:b/>
+                <w:bCs/>
+                <w:color w:val="1B1B1B"/>
                 <w:sz w:val="18"/>
                 <w:szCs w:val="18"/>
               </w:rPr>
@@ -2153,10 +2140,10 @@
           <w:tcPr>
             <w:tcW w:type="dxa" w:w="1880"/>
             <w:tcBorders>
-              <w:top w:val="single" w:color="8FA3AA" w:sz="4"/>
-              <w:left w:val="single" w:color="8FA3AA" w:sz="4"/>
-              <w:bottom w:val="single" w:color="8FA3AA" w:sz="4"/>
-              <w:right w:val="single" w:color="8FA3AA" w:sz="4"/>
+              <w:top w:val="single" w:color="8C8C8C" w:sz="4"/>
+              <w:left w:val="single" w:color="8C8C8C" w:sz="4"/>
+              <w:bottom w:val="single" w:color="8C8C8C" w:sz="4"/>
+              <w:right w:val="single" w:color="8C8C8C" w:sz="4"/>
             </w:tcBorders>
             <w:tcMar>
               <w:top w:type="dxa" w:w="70"/>
@@ -2193,10 +2180,10 @@
           <w:tcPr>
             <w:tcW w:type="dxa" w:w="2280"/>
             <w:tcBorders>
-              <w:top w:val="single" w:color="8FA3AA" w:sz="4"/>
-              <w:left w:val="single" w:color="8FA3AA" w:sz="4"/>
-              <w:bottom w:val="single" w:color="8FA3AA" w:sz="4"/>
-              <w:right w:val="single" w:color="8FA3AA" w:sz="4"/>
+              <w:top w:val="single" w:color="8C8C8C" w:sz="4"/>
+              <w:left w:val="single" w:color="8C8C8C" w:sz="4"/>
+              <w:bottom w:val="single" w:color="8C8C8C" w:sz="4"/>
+              <w:right w:val="single" w:color="8C8C8C" w:sz="4"/>
             </w:tcBorders>
             <w:tcMar>
               <w:top w:type="dxa" w:w="70"/>
@@ -2236,10 +2223,10 @@
           <w:tcPr>
             <w:tcW w:type="dxa" w:w="2550"/>
             <w:tcBorders>
-              <w:top w:val="single" w:color="8FA3AA" w:sz="4"/>
-              <w:left w:val="single" w:color="8FA3AA" w:sz="4"/>
-              <w:bottom w:val="single" w:color="8FA3AA" w:sz="4"/>
-              <w:right w:val="single" w:color="8FA3AA" w:sz="4"/>
+              <w:top w:val="single" w:color="8C8C8C" w:sz="4"/>
+              <w:left w:val="single" w:color="8C8C8C" w:sz="4"/>
+              <w:bottom w:val="single" w:color="8C8C8C" w:sz="4"/>
+              <w:right w:val="single" w:color="8C8C8C" w:sz="4"/>
             </w:tcBorders>
             <w:tcMar>
               <w:top w:type="dxa" w:w="70"/>
@@ -2279,10 +2266,10 @@
           <w:tcPr>
             <w:tcW w:type="dxa" w:w="2302"/>
             <w:tcBorders>
-              <w:top w:val="single" w:color="8FA3AA" w:sz="4"/>
-              <w:left w:val="single" w:color="8FA3AA" w:sz="4"/>
-              <w:bottom w:val="single" w:color="8FA3AA" w:sz="4"/>
-              <w:right w:val="single" w:color="8FA3AA" w:sz="4"/>
+              <w:top w:val="single" w:color="8C8C8C" w:sz="4"/>
+              <w:left w:val="single" w:color="8C8C8C" w:sz="4"/>
+              <w:bottom w:val="single" w:color="8C8C8C" w:sz="4"/>
+              <w:right w:val="single" w:color="8C8C8C" w:sz="4"/>
             </w:tcBorders>
             <w:tcMar>
               <w:top w:type="dxa" w:w="70"/>
@@ -2393,26 +2380,25 @@
           <w:tcPr>
             <w:tcW w:type="dxa" w:w="1500"/>
             <w:tcBorders>
-              <w:top w:val="single" w:color="8FA3AA" w:sz="4"/>
-              <w:left w:val="single" w:color="8FA3AA" w:sz="4"/>
-              <w:bottom w:val="single" w:color="8FA3AA" w:sz="4"/>
-              <w:right w:val="single" w:color="8FA3AA" w:sz="4"/>
-            </w:tcBorders>
-            <w:shd w:fill="1F4E5F" w:color="auto" w:val="clear"/>
-            <w:tcMar>
-              <w:top w:type="dxa" w:w="70"/>
-              <w:left w:type="dxa" w:w="90"/>
-              <w:bottom w:type="dxa" w:w="70"/>
-              <w:right w:type="dxa" w:w="90"/>
-            </w:tcMar>
-          </w:tcPr>
-          <w:p>
-            <w:r>
-              <w:rPr>
-                <w:rFonts w:ascii="Arial" w:cs="Arial" w:eastAsia="Arial" w:hAnsi="Arial"/>
-                <w:b/>
-                <w:bCs/>
-                <w:color w:val="FFFFFF"/>
+              <w:top w:val="single" w:color="8C8C8C" w:sz="4"/>
+              <w:left w:val="single" w:color="8C8C8C" w:sz="4"/>
+              <w:bottom w:val="single" w:color="8C8C8C" w:sz="4"/>
+              <w:right w:val="single" w:color="8C8C8C" w:sz="4"/>
+            </w:tcBorders>
+            <w:tcMar>
+              <w:top w:type="dxa" w:w="70"/>
+              <w:left w:type="dxa" w:w="90"/>
+              <w:bottom w:type="dxa" w:w="70"/>
+              <w:right w:type="dxa" w:w="90"/>
+            </w:tcMar>
+          </w:tcPr>
+          <w:p>
+            <w:r>
+              <w:rPr>
+                <w:rFonts w:ascii="Arial" w:cs="Arial" w:eastAsia="Arial" w:hAnsi="Arial"/>
+                <w:b/>
+                <w:bCs/>
+                <w:color w:val="1B1B1B"/>
                 <w:sz w:val="18"/>
                 <w:szCs w:val="18"/>
               </w:rPr>
@@ -2424,10 +2410,10 @@
           <w:tcPr>
             <w:tcW w:type="dxa" w:w="1880"/>
             <w:tcBorders>
-              <w:top w:val="single" w:color="8FA3AA" w:sz="4"/>
-              <w:left w:val="single" w:color="8FA3AA" w:sz="4"/>
-              <w:bottom w:val="single" w:color="8FA3AA" w:sz="4"/>
-              <w:right w:val="single" w:color="8FA3AA" w:sz="4"/>
+              <w:top w:val="single" w:color="8C8C8C" w:sz="4"/>
+              <w:left w:val="single" w:color="8C8C8C" w:sz="4"/>
+              <w:bottom w:val="single" w:color="8C8C8C" w:sz="4"/>
+              <w:right w:val="single" w:color="8C8C8C" w:sz="4"/>
             </w:tcBorders>
             <w:tcMar>
               <w:top w:type="dxa" w:w="70"/>
@@ -2464,10 +2450,10 @@
           <w:tcPr>
             <w:tcW w:type="dxa" w:w="2280"/>
             <w:tcBorders>
-              <w:top w:val="single" w:color="8FA3AA" w:sz="4"/>
-              <w:left w:val="single" w:color="8FA3AA" w:sz="4"/>
-              <w:bottom w:val="single" w:color="8FA3AA" w:sz="4"/>
-              <w:right w:val="single" w:color="8FA3AA" w:sz="4"/>
+              <w:top w:val="single" w:color="8C8C8C" w:sz="4"/>
+              <w:left w:val="single" w:color="8C8C8C" w:sz="4"/>
+              <w:bottom w:val="single" w:color="8C8C8C" w:sz="4"/>
+              <w:right w:val="single" w:color="8C8C8C" w:sz="4"/>
             </w:tcBorders>
             <w:tcMar>
               <w:top w:type="dxa" w:w="70"/>
@@ -2494,10 +2480,10 @@
           <w:tcPr>
             <w:tcW w:type="dxa" w:w="2550"/>
             <w:tcBorders>
-              <w:top w:val="single" w:color="8FA3AA" w:sz="4"/>
-              <w:left w:val="single" w:color="8FA3AA" w:sz="4"/>
-              <w:bottom w:val="single" w:color="8FA3AA" w:sz="4"/>
-              <w:right w:val="single" w:color="8FA3AA" w:sz="4"/>
+              <w:top w:val="single" w:color="8C8C8C" w:sz="4"/>
+              <w:left w:val="single" w:color="8C8C8C" w:sz="4"/>
+              <w:bottom w:val="single" w:color="8C8C8C" w:sz="4"/>
+              <w:right w:val="single" w:color="8C8C8C" w:sz="4"/>
             </w:tcBorders>
             <w:tcMar>
               <w:top w:type="dxa" w:w="70"/>
@@ -2537,10 +2523,10 @@
           <w:tcPr>
             <w:tcW w:type="dxa" w:w="2302"/>
             <w:tcBorders>
-              <w:top w:val="single" w:color="8FA3AA" w:sz="4"/>
-              <w:left w:val="single" w:color="8FA3AA" w:sz="4"/>
-              <w:bottom w:val="single" w:color="8FA3AA" w:sz="4"/>
-              <w:right w:val="single" w:color="8FA3AA" w:sz="4"/>
+              <w:top w:val="single" w:color="8C8C8C" w:sz="4"/>
+              <w:left w:val="single" w:color="8C8C8C" w:sz="4"/>
+              <w:bottom w:val="single" w:color="8C8C8C" w:sz="4"/>
+              <w:right w:val="single" w:color="8C8C8C" w:sz="4"/>
             </w:tcBorders>
             <w:tcMar>
               <w:top w:type="dxa" w:w="70"/>
@@ -2651,26 +2637,25 @@
           <w:tcPr>
             <w:tcW w:type="dxa" w:w="1500"/>
             <w:tcBorders>
-              <w:top w:val="single" w:color="8FA3AA" w:sz="4"/>
-              <w:left w:val="single" w:color="8FA3AA" w:sz="4"/>
-              <w:bottom w:val="single" w:color="8FA3AA" w:sz="4"/>
-              <w:right w:val="single" w:color="8FA3AA" w:sz="4"/>
-            </w:tcBorders>
-            <w:shd w:fill="1F4E5F" w:color="auto" w:val="clear"/>
-            <w:tcMar>
-              <w:top w:type="dxa" w:w="70"/>
-              <w:left w:type="dxa" w:w="90"/>
-              <w:bottom w:type="dxa" w:w="70"/>
-              <w:right w:type="dxa" w:w="90"/>
-            </w:tcMar>
-          </w:tcPr>
-          <w:p>
-            <w:r>
-              <w:rPr>
-                <w:rFonts w:ascii="Arial" w:cs="Arial" w:eastAsia="Arial" w:hAnsi="Arial"/>
-                <w:b/>
-                <w:bCs/>
-                <w:color w:val="FFFFFF"/>
+              <w:top w:val="single" w:color="8C8C8C" w:sz="4"/>
+              <w:left w:val="single" w:color="8C8C8C" w:sz="4"/>
+              <w:bottom w:val="single" w:color="8C8C8C" w:sz="4"/>
+              <w:right w:val="single" w:color="8C8C8C" w:sz="4"/>
+            </w:tcBorders>
+            <w:tcMar>
+              <w:top w:type="dxa" w:w="70"/>
+              <w:left w:type="dxa" w:w="90"/>
+              <w:bottom w:type="dxa" w:w="70"/>
+              <w:right w:type="dxa" w:w="90"/>
+            </w:tcMar>
+          </w:tcPr>
+          <w:p>
+            <w:r>
+              <w:rPr>
+                <w:rFonts w:ascii="Arial" w:cs="Arial" w:eastAsia="Arial" w:hAnsi="Arial"/>
+                <w:b/>
+                <w:bCs/>
+                <w:color w:val="1B1B1B"/>
                 <w:sz w:val="18"/>
                 <w:szCs w:val="18"/>
               </w:rPr>
@@ -2682,10 +2667,10 @@
           <w:tcPr>
             <w:tcW w:type="dxa" w:w="1880"/>
             <w:tcBorders>
-              <w:top w:val="single" w:color="8FA3AA" w:sz="4"/>
-              <w:left w:val="single" w:color="8FA3AA" w:sz="4"/>
-              <w:bottom w:val="single" w:color="8FA3AA" w:sz="4"/>
-              <w:right w:val="single" w:color="8FA3AA" w:sz="4"/>
+              <w:top w:val="single" w:color="8C8C8C" w:sz="4"/>
+              <w:left w:val="single" w:color="8C8C8C" w:sz="4"/>
+              <w:bottom w:val="single" w:color="8C8C8C" w:sz="4"/>
+              <w:right w:val="single" w:color="8C8C8C" w:sz="4"/>
             </w:tcBorders>
             <w:tcMar>
               <w:top w:type="dxa" w:w="70"/>
@@ -2722,10 +2707,10 @@
           <w:tcPr>
             <w:tcW w:type="dxa" w:w="2280"/>
             <w:tcBorders>
-              <w:top w:val="single" w:color="8FA3AA" w:sz="4"/>
-              <w:left w:val="single" w:color="8FA3AA" w:sz="4"/>
-              <w:bottom w:val="single" w:color="8FA3AA" w:sz="4"/>
-              <w:right w:val="single" w:color="8FA3AA" w:sz="4"/>
+              <w:top w:val="single" w:color="8C8C8C" w:sz="4"/>
+              <w:left w:val="single" w:color="8C8C8C" w:sz="4"/>
+              <w:bottom w:val="single" w:color="8C8C8C" w:sz="4"/>
+              <w:right w:val="single" w:color="8C8C8C" w:sz="4"/>
             </w:tcBorders>
             <w:tcMar>
               <w:top w:type="dxa" w:w="70"/>
@@ -2765,10 +2750,10 @@
           <w:tcPr>
             <w:tcW w:type="dxa" w:w="2550"/>
             <w:tcBorders>
-              <w:top w:val="single" w:color="8FA3AA" w:sz="4"/>
-              <w:left w:val="single" w:color="8FA3AA" w:sz="4"/>
-              <w:bottom w:val="single" w:color="8FA3AA" w:sz="4"/>
-              <w:right w:val="single" w:color="8FA3AA" w:sz="4"/>
+              <w:top w:val="single" w:color="8C8C8C" w:sz="4"/>
+              <w:left w:val="single" w:color="8C8C8C" w:sz="4"/>
+              <w:bottom w:val="single" w:color="8C8C8C" w:sz="4"/>
+              <w:right w:val="single" w:color="8C8C8C" w:sz="4"/>
             </w:tcBorders>
             <w:tcMar>
               <w:top w:type="dxa" w:w="70"/>
@@ -2808,10 +2793,10 @@
           <w:tcPr>
             <w:tcW w:type="dxa" w:w="2302"/>
             <w:tcBorders>
-              <w:top w:val="single" w:color="8FA3AA" w:sz="4"/>
-              <w:left w:val="single" w:color="8FA3AA" w:sz="4"/>
-              <w:bottom w:val="single" w:color="8FA3AA" w:sz="4"/>
-              <w:right w:val="single" w:color="8FA3AA" w:sz="4"/>
+              <w:top w:val="single" w:color="8C8C8C" w:sz="4"/>
+              <w:left w:val="single" w:color="8C8C8C" w:sz="4"/>
+              <w:bottom w:val="single" w:color="8C8C8C" w:sz="4"/>
+              <w:right w:val="single" w:color="8C8C8C" w:sz="4"/>
             </w:tcBorders>
             <w:tcMar>
               <w:top w:type="dxa" w:w="70"/>
@@ -2922,26 +2907,25 @@
           <w:tcPr>
             <w:tcW w:type="dxa" w:w="1500"/>
             <w:tcBorders>
-              <w:top w:val="single" w:color="8FA3AA" w:sz="4"/>
-              <w:left w:val="single" w:color="8FA3AA" w:sz="4"/>
-              <w:bottom w:val="single" w:color="8FA3AA" w:sz="4"/>
-              <w:right w:val="single" w:color="8FA3AA" w:sz="4"/>
-            </w:tcBorders>
-            <w:shd w:fill="1F4E5F" w:color="auto" w:val="clear"/>
-            <w:tcMar>
-              <w:top w:type="dxa" w:w="70"/>
-              <w:left w:type="dxa" w:w="90"/>
-              <w:bottom w:type="dxa" w:w="70"/>
-              <w:right w:type="dxa" w:w="90"/>
-            </w:tcMar>
-          </w:tcPr>
-          <w:p>
-            <w:r>
-              <w:rPr>
-                <w:rFonts w:ascii="Arial" w:cs="Arial" w:eastAsia="Arial" w:hAnsi="Arial"/>
-                <w:b/>
-                <w:bCs/>
-                <w:color w:val="FFFFFF"/>
+              <w:top w:val="single" w:color="8C8C8C" w:sz="4"/>
+              <w:left w:val="single" w:color="8C8C8C" w:sz="4"/>
+              <w:bottom w:val="single" w:color="8C8C8C" w:sz="4"/>
+              <w:right w:val="single" w:color="8C8C8C" w:sz="4"/>
+            </w:tcBorders>
+            <w:tcMar>
+              <w:top w:type="dxa" w:w="70"/>
+              <w:left w:type="dxa" w:w="90"/>
+              <w:bottom w:type="dxa" w:w="70"/>
+              <w:right w:type="dxa" w:w="90"/>
+            </w:tcMar>
+          </w:tcPr>
+          <w:p>
+            <w:r>
+              <w:rPr>
+                <w:rFonts w:ascii="Arial" w:cs="Arial" w:eastAsia="Arial" w:hAnsi="Arial"/>
+                <w:b/>
+                <w:bCs/>
+                <w:color w:val="1B1B1B"/>
                 <w:sz w:val="18"/>
                 <w:szCs w:val="18"/>
               </w:rPr>
@@ -2953,10 +2937,10 @@
           <w:tcPr>
             <w:tcW w:type="dxa" w:w="1880"/>
             <w:tcBorders>
-              <w:top w:val="single" w:color="8FA3AA" w:sz="4"/>
-              <w:left w:val="single" w:color="8FA3AA" w:sz="4"/>
-              <w:bottom w:val="single" w:color="8FA3AA" w:sz="4"/>
-              <w:right w:val="single" w:color="8FA3AA" w:sz="4"/>
+              <w:top w:val="single" w:color="8C8C8C" w:sz="4"/>
+              <w:left w:val="single" w:color="8C8C8C" w:sz="4"/>
+              <w:bottom w:val="single" w:color="8C8C8C" w:sz="4"/>
+              <w:right w:val="single" w:color="8C8C8C" w:sz="4"/>
             </w:tcBorders>
             <w:tcMar>
               <w:top w:type="dxa" w:w="70"/>
@@ -2993,10 +2977,10 @@
           <w:tcPr>
             <w:tcW w:type="dxa" w:w="2280"/>
             <w:tcBorders>
-              <w:top w:val="single" w:color="8FA3AA" w:sz="4"/>
-              <w:left w:val="single" w:color="8FA3AA" w:sz="4"/>
-              <w:bottom w:val="single" w:color="8FA3AA" w:sz="4"/>
-              <w:right w:val="single" w:color="8FA3AA" w:sz="4"/>
+              <w:top w:val="single" w:color="8C8C8C" w:sz="4"/>
+              <w:left w:val="single" w:color="8C8C8C" w:sz="4"/>
+              <w:bottom w:val="single" w:color="8C8C8C" w:sz="4"/>
+              <w:right w:val="single" w:color="8C8C8C" w:sz="4"/>
             </w:tcBorders>
             <w:tcMar>
               <w:top w:type="dxa" w:w="70"/>
@@ -3023,10 +3007,10 @@
           <w:tcPr>
             <w:tcW w:type="dxa" w:w="2550"/>
             <w:tcBorders>
-              <w:top w:val="single" w:color="8FA3AA" w:sz="4"/>
-              <w:left w:val="single" w:color="8FA3AA" w:sz="4"/>
-              <w:bottom w:val="single" w:color="8FA3AA" w:sz="4"/>
-              <w:right w:val="single" w:color="8FA3AA" w:sz="4"/>
+              <w:top w:val="single" w:color="8C8C8C" w:sz="4"/>
+              <w:left w:val="single" w:color="8C8C8C" w:sz="4"/>
+              <w:bottom w:val="single" w:color="8C8C8C" w:sz="4"/>
+              <w:right w:val="single" w:color="8C8C8C" w:sz="4"/>
             </w:tcBorders>
             <w:tcMar>
               <w:top w:type="dxa" w:w="70"/>
@@ -3066,10 +3050,10 @@
           <w:tcPr>
             <w:tcW w:type="dxa" w:w="2302"/>
             <w:tcBorders>
-              <w:top w:val="single" w:color="8FA3AA" w:sz="4"/>
-              <w:left w:val="single" w:color="8FA3AA" w:sz="4"/>
-              <w:bottom w:val="single" w:color="8FA3AA" w:sz="4"/>
-              <w:right w:val="single" w:color="8FA3AA" w:sz="4"/>
+              <w:top w:val="single" w:color="8C8C8C" w:sz="4"/>
+              <w:left w:val="single" w:color="8C8C8C" w:sz="4"/>
+              <w:bottom w:val="single" w:color="8C8C8C" w:sz="4"/>
+              <w:right w:val="single" w:color="8C8C8C" w:sz="4"/>
             </w:tcBorders>
             <w:tcMar>
               <w:top w:type="dxa" w:w="70"/>
@@ -3180,26 +3164,25 @@
           <w:tcPr>
             <w:tcW w:type="dxa" w:w="1500"/>
             <w:tcBorders>
-              <w:top w:val="single" w:color="8FA3AA" w:sz="4"/>
-              <w:left w:val="single" w:color="8FA3AA" w:sz="4"/>
-              <w:bottom w:val="single" w:color="8FA3AA" w:sz="4"/>
-              <w:right w:val="single" w:color="8FA3AA" w:sz="4"/>
-            </w:tcBorders>
-            <w:shd w:fill="1F4E5F" w:color="auto" w:val="clear"/>
-            <w:tcMar>
-              <w:top w:type="dxa" w:w="70"/>
-              <w:left w:type="dxa" w:w="90"/>
-              <w:bottom w:type="dxa" w:w="70"/>
-              <w:right w:type="dxa" w:w="90"/>
-            </w:tcMar>
-          </w:tcPr>
-          <w:p>
-            <w:r>
-              <w:rPr>
-                <w:rFonts w:ascii="Arial" w:cs="Arial" w:eastAsia="Arial" w:hAnsi="Arial"/>
-                <w:b/>
-                <w:bCs/>
-                <w:color w:val="FFFFFF"/>
+              <w:top w:val="single" w:color="8C8C8C" w:sz="4"/>
+              <w:left w:val="single" w:color="8C8C8C" w:sz="4"/>
+              <w:bottom w:val="single" w:color="8C8C8C" w:sz="4"/>
+              <w:right w:val="single" w:color="8C8C8C" w:sz="4"/>
+            </w:tcBorders>
+            <w:tcMar>
+              <w:top w:type="dxa" w:w="70"/>
+              <w:left w:type="dxa" w:w="90"/>
+              <w:bottom w:type="dxa" w:w="70"/>
+              <w:right w:type="dxa" w:w="90"/>
+            </w:tcMar>
+          </w:tcPr>
+          <w:p>
+            <w:r>
+              <w:rPr>
+                <w:rFonts w:ascii="Arial" w:cs="Arial" w:eastAsia="Arial" w:hAnsi="Arial"/>
+                <w:b/>
+                <w:bCs/>
+                <w:color w:val="1B1B1B"/>
                 <w:sz w:val="18"/>
                 <w:szCs w:val="18"/>
               </w:rPr>
@@ -3211,10 +3194,10 @@
           <w:tcPr>
             <w:tcW w:type="dxa" w:w="1880"/>
             <w:tcBorders>
-              <w:top w:val="single" w:color="8FA3AA" w:sz="4"/>
-              <w:left w:val="single" w:color="8FA3AA" w:sz="4"/>
-              <w:bottom w:val="single" w:color="8FA3AA" w:sz="4"/>
-              <w:right w:val="single" w:color="8FA3AA" w:sz="4"/>
+              <w:top w:val="single" w:color="8C8C8C" w:sz="4"/>
+              <w:left w:val="single" w:color="8C8C8C" w:sz="4"/>
+              <w:bottom w:val="single" w:color="8C8C8C" w:sz="4"/>
+              <w:right w:val="single" w:color="8C8C8C" w:sz="4"/>
             </w:tcBorders>
             <w:tcMar>
               <w:top w:type="dxa" w:w="70"/>
@@ -3251,10 +3234,10 @@
           <w:tcPr>
             <w:tcW w:type="dxa" w:w="2280"/>
             <w:tcBorders>
-              <w:top w:val="single" w:color="8FA3AA" w:sz="4"/>
-              <w:left w:val="single" w:color="8FA3AA" w:sz="4"/>
-              <w:bottom w:val="single" w:color="8FA3AA" w:sz="4"/>
-              <w:right w:val="single" w:color="8FA3AA" w:sz="4"/>
+              <w:top w:val="single" w:color="8C8C8C" w:sz="4"/>
+              <w:left w:val="single" w:color="8C8C8C" w:sz="4"/>
+              <w:bottom w:val="single" w:color="8C8C8C" w:sz="4"/>
+              <w:right w:val="single" w:color="8C8C8C" w:sz="4"/>
             </w:tcBorders>
             <w:tcMar>
               <w:top w:type="dxa" w:w="70"/>
@@ -3281,10 +3264,10 @@
           <w:tcPr>
             <w:tcW w:type="dxa" w:w="2550"/>
             <w:tcBorders>
-              <w:top w:val="single" w:color="8FA3AA" w:sz="4"/>
-              <w:left w:val="single" w:color="8FA3AA" w:sz="4"/>
-              <w:bottom w:val="single" w:color="8FA3AA" w:sz="4"/>
-              <w:right w:val="single" w:color="8FA3AA" w:sz="4"/>
+              <w:top w:val="single" w:color="8C8C8C" w:sz="4"/>
+              <w:left w:val="single" w:color="8C8C8C" w:sz="4"/>
+              <w:bottom w:val="single" w:color="8C8C8C" w:sz="4"/>
+              <w:right w:val="single" w:color="8C8C8C" w:sz="4"/>
             </w:tcBorders>
             <w:tcMar>
               <w:top w:type="dxa" w:w="70"/>
@@ -3324,10 +3307,10 @@
           <w:tcPr>
             <w:tcW w:type="dxa" w:w="2302"/>
             <w:tcBorders>
-              <w:top w:val="single" w:color="8FA3AA" w:sz="4"/>
-              <w:left w:val="single" w:color="8FA3AA" w:sz="4"/>
-              <w:bottom w:val="single" w:color="8FA3AA" w:sz="4"/>
-              <w:right w:val="single" w:color="8FA3AA" w:sz="4"/>
+              <w:top w:val="single" w:color="8C8C8C" w:sz="4"/>
+              <w:left w:val="single" w:color="8C8C8C" w:sz="4"/>
+              <w:bottom w:val="single" w:color="8C8C8C" w:sz="4"/>
+              <w:right w:val="single" w:color="8C8C8C" w:sz="4"/>
             </w:tcBorders>
             <w:tcMar>
               <w:top w:type="dxa" w:w="70"/>
@@ -3438,26 +3421,25 @@
           <w:tcPr>
             <w:tcW w:type="dxa" w:w="1500"/>
             <w:tcBorders>
-              <w:top w:val="single" w:color="8FA3AA" w:sz="4"/>
-              <w:left w:val="single" w:color="8FA3AA" w:sz="4"/>
-              <w:bottom w:val="single" w:color="8FA3AA" w:sz="4"/>
-              <w:right w:val="single" w:color="8FA3AA" w:sz="4"/>
-            </w:tcBorders>
-            <w:shd w:fill="1F4E5F" w:color="auto" w:val="clear"/>
-            <w:tcMar>
-              <w:top w:type="dxa" w:w="70"/>
-              <w:left w:type="dxa" w:w="90"/>
-              <w:bottom w:type="dxa" w:w="70"/>
-              <w:right w:type="dxa" w:w="90"/>
-            </w:tcMar>
-          </w:tcPr>
-          <w:p>
-            <w:r>
-              <w:rPr>
-                <w:rFonts w:ascii="Arial" w:cs="Arial" w:eastAsia="Arial" w:hAnsi="Arial"/>
-                <w:b/>
-                <w:bCs/>
-                <w:color w:val="FFFFFF"/>
+              <w:top w:val="single" w:color="8C8C8C" w:sz="4"/>
+              <w:left w:val="single" w:color="8C8C8C" w:sz="4"/>
+              <w:bottom w:val="single" w:color="8C8C8C" w:sz="4"/>
+              <w:right w:val="single" w:color="8C8C8C" w:sz="4"/>
+            </w:tcBorders>
+            <w:tcMar>
+              <w:top w:type="dxa" w:w="70"/>
+              <w:left w:type="dxa" w:w="90"/>
+              <w:bottom w:type="dxa" w:w="70"/>
+              <w:right w:type="dxa" w:w="90"/>
+            </w:tcMar>
+          </w:tcPr>
+          <w:p>
+            <w:r>
+              <w:rPr>
+                <w:rFonts w:ascii="Arial" w:cs="Arial" w:eastAsia="Arial" w:hAnsi="Arial"/>
+                <w:b/>
+                <w:bCs/>
+                <w:color w:val="1B1B1B"/>
                 <w:sz w:val="18"/>
                 <w:szCs w:val="18"/>
               </w:rPr>
@@ -3469,10 +3451,10 @@
           <w:tcPr>
             <w:tcW w:type="dxa" w:w="1880"/>
             <w:tcBorders>
-              <w:top w:val="single" w:color="8FA3AA" w:sz="4"/>
-              <w:left w:val="single" w:color="8FA3AA" w:sz="4"/>
-              <w:bottom w:val="single" w:color="8FA3AA" w:sz="4"/>
-              <w:right w:val="single" w:color="8FA3AA" w:sz="4"/>
+              <w:top w:val="single" w:color="8C8C8C" w:sz="4"/>
+              <w:left w:val="single" w:color="8C8C8C" w:sz="4"/>
+              <w:bottom w:val="single" w:color="8C8C8C" w:sz="4"/>
+              <w:right w:val="single" w:color="8C8C8C" w:sz="4"/>
             </w:tcBorders>
             <w:tcMar>
               <w:top w:type="dxa" w:w="70"/>
@@ -3509,10 +3491,10 @@
           <w:tcPr>
             <w:tcW w:type="dxa" w:w="2280"/>
             <w:tcBorders>
-              <w:top w:val="single" w:color="8FA3AA" w:sz="4"/>
-              <w:left w:val="single" w:color="8FA3AA" w:sz="4"/>
-              <w:bottom w:val="single" w:color="8FA3AA" w:sz="4"/>
-              <w:right w:val="single" w:color="8FA3AA" w:sz="4"/>
+              <w:top w:val="single" w:color="8C8C8C" w:sz="4"/>
+              <w:left w:val="single" w:color="8C8C8C" w:sz="4"/>
+              <w:bottom w:val="single" w:color="8C8C8C" w:sz="4"/>
+              <w:right w:val="single" w:color="8C8C8C" w:sz="4"/>
             </w:tcBorders>
             <w:tcMar>
               <w:top w:type="dxa" w:w="70"/>
@@ -3539,10 +3521,10 @@
           <w:tcPr>
             <w:tcW w:type="dxa" w:w="2550"/>
             <w:tcBorders>
-              <w:top w:val="single" w:color="8FA3AA" w:sz="4"/>
-              <w:left w:val="single" w:color="8FA3AA" w:sz="4"/>
-              <w:bottom w:val="single" w:color="8FA3AA" w:sz="4"/>
-              <w:right w:val="single" w:color="8FA3AA" w:sz="4"/>
+              <w:top w:val="single" w:color="8C8C8C" w:sz="4"/>
+              <w:left w:val="single" w:color="8C8C8C" w:sz="4"/>
+              <w:bottom w:val="single" w:color="8C8C8C" w:sz="4"/>
+              <w:right w:val="single" w:color="8C8C8C" w:sz="4"/>
             </w:tcBorders>
             <w:tcMar>
               <w:top w:type="dxa" w:w="70"/>
@@ -3582,10 +3564,10 @@
           <w:tcPr>
             <w:tcW w:type="dxa" w:w="2302"/>
             <w:tcBorders>
-              <w:top w:val="single" w:color="8FA3AA" w:sz="4"/>
-              <w:left w:val="single" w:color="8FA3AA" w:sz="4"/>
-              <w:bottom w:val="single" w:color="8FA3AA" w:sz="4"/>
-              <w:right w:val="single" w:color="8FA3AA" w:sz="4"/>
+              <w:top w:val="single" w:color="8C8C8C" w:sz="4"/>
+              <w:left w:val="single" w:color="8C8C8C" w:sz="4"/>
+              <w:bottom w:val="single" w:color="8C8C8C" w:sz="4"/>
+              <w:right w:val="single" w:color="8C8C8C" w:sz="4"/>
             </w:tcBorders>
             <w:tcMar>
               <w:top w:type="dxa" w:w="70"/>
@@ -3696,26 +3678,25 @@
           <w:tcPr>
             <w:tcW w:type="dxa" w:w="1500"/>
             <w:tcBorders>
-              <w:top w:val="single" w:color="8FA3AA" w:sz="4"/>
-              <w:left w:val="single" w:color="8FA3AA" w:sz="4"/>
-              <w:bottom w:val="single" w:color="8FA3AA" w:sz="4"/>
-              <w:right w:val="single" w:color="8FA3AA" w:sz="4"/>
-            </w:tcBorders>
-            <w:shd w:fill="1F4E5F" w:color="auto" w:val="clear"/>
-            <w:tcMar>
-              <w:top w:type="dxa" w:w="70"/>
-              <w:left w:type="dxa" w:w="90"/>
-              <w:bottom w:type="dxa" w:w="70"/>
-              <w:right w:type="dxa" w:w="90"/>
-            </w:tcMar>
-          </w:tcPr>
-          <w:p>
-            <w:r>
-              <w:rPr>
-                <w:rFonts w:ascii="Arial" w:cs="Arial" w:eastAsia="Arial" w:hAnsi="Arial"/>
-                <w:b/>
-                <w:bCs/>
-                <w:color w:val="FFFFFF"/>
+              <w:top w:val="single" w:color="8C8C8C" w:sz="4"/>
+              <w:left w:val="single" w:color="8C8C8C" w:sz="4"/>
+              <w:bottom w:val="single" w:color="8C8C8C" w:sz="4"/>
+              <w:right w:val="single" w:color="8C8C8C" w:sz="4"/>
+            </w:tcBorders>
+            <w:tcMar>
+              <w:top w:type="dxa" w:w="70"/>
+              <w:left w:type="dxa" w:w="90"/>
+              <w:bottom w:type="dxa" w:w="70"/>
+              <w:right w:type="dxa" w:w="90"/>
+            </w:tcMar>
+          </w:tcPr>
+          <w:p>
+            <w:r>
+              <w:rPr>
+                <w:rFonts w:ascii="Arial" w:cs="Arial" w:eastAsia="Arial" w:hAnsi="Arial"/>
+                <w:b/>
+                <w:bCs/>
+                <w:color w:val="1B1B1B"/>
                 <w:sz w:val="18"/>
                 <w:szCs w:val="18"/>
               </w:rPr>
@@ -3727,10 +3708,10 @@
           <w:tcPr>
             <w:tcW w:type="dxa" w:w="1880"/>
             <w:tcBorders>
-              <w:top w:val="single" w:color="8FA3AA" w:sz="4"/>
-              <w:left w:val="single" w:color="8FA3AA" w:sz="4"/>
-              <w:bottom w:val="single" w:color="8FA3AA" w:sz="4"/>
-              <w:right w:val="single" w:color="8FA3AA" w:sz="4"/>
+              <w:top w:val="single" w:color="8C8C8C" w:sz="4"/>
+              <w:left w:val="single" w:color="8C8C8C" w:sz="4"/>
+              <w:bottom w:val="single" w:color="8C8C8C" w:sz="4"/>
+              <w:right w:val="single" w:color="8C8C8C" w:sz="4"/>
             </w:tcBorders>
             <w:tcMar>
               <w:top w:type="dxa" w:w="70"/>
@@ -3767,10 +3748,10 @@
           <w:tcPr>
             <w:tcW w:type="dxa" w:w="2280"/>
             <w:tcBorders>
-              <w:top w:val="single" w:color="8FA3AA" w:sz="4"/>
-              <w:left w:val="single" w:color="8FA3AA" w:sz="4"/>
-              <w:bottom w:val="single" w:color="8FA3AA" w:sz="4"/>
-              <w:right w:val="single" w:color="8FA3AA" w:sz="4"/>
+              <w:top w:val="single" w:color="8C8C8C" w:sz="4"/>
+              <w:left w:val="single" w:color="8C8C8C" w:sz="4"/>
+              <w:bottom w:val="single" w:color="8C8C8C" w:sz="4"/>
+              <w:right w:val="single" w:color="8C8C8C" w:sz="4"/>
             </w:tcBorders>
             <w:tcMar>
               <w:top w:type="dxa" w:w="70"/>
@@ -3797,10 +3778,10 @@
           <w:tcPr>
             <w:tcW w:type="dxa" w:w="2550"/>
             <w:tcBorders>
-              <w:top w:val="single" w:color="8FA3AA" w:sz="4"/>
-              <w:left w:val="single" w:color="8FA3AA" w:sz="4"/>
-              <w:bottom w:val="single" w:color="8FA3AA" w:sz="4"/>
-              <w:right w:val="single" w:color="8FA3AA" w:sz="4"/>
+              <w:top w:val="single" w:color="8C8C8C" w:sz="4"/>
+              <w:left w:val="single" w:color="8C8C8C" w:sz="4"/>
+              <w:bottom w:val="single" w:color="8C8C8C" w:sz="4"/>
+              <w:right w:val="single" w:color="8C8C8C" w:sz="4"/>
             </w:tcBorders>
             <w:tcMar>
               <w:top w:type="dxa" w:w="70"/>
@@ -3840,10 +3821,10 @@
           <w:tcPr>
             <w:tcW w:type="dxa" w:w="2302"/>
             <w:tcBorders>
-              <w:top w:val="single" w:color="8FA3AA" w:sz="4"/>
-              <w:left w:val="single" w:color="8FA3AA" w:sz="4"/>
-              <w:bottom w:val="single" w:color="8FA3AA" w:sz="4"/>
-              <w:right w:val="single" w:color="8FA3AA" w:sz="4"/>
+              <w:top w:val="single" w:color="8C8C8C" w:sz="4"/>
+              <w:left w:val="single" w:color="8C8C8C" w:sz="4"/>
+              <w:bottom w:val="single" w:color="8C8C8C" w:sz="4"/>
+              <w:right w:val="single" w:color="8C8C8C" w:sz="4"/>
             </w:tcBorders>
             <w:tcMar>
               <w:top w:type="dxa" w:w="70"/>
@@ -3954,26 +3935,25 @@
           <w:tcPr>
             <w:tcW w:type="dxa" w:w="1500"/>
             <w:tcBorders>
-              <w:top w:val="single" w:color="8FA3AA" w:sz="4"/>
-              <w:left w:val="single" w:color="8FA3AA" w:sz="4"/>
-              <w:bottom w:val="single" w:color="8FA3AA" w:sz="4"/>
-              <w:right w:val="single" w:color="8FA3AA" w:sz="4"/>
-            </w:tcBorders>
-            <w:shd w:fill="1F4E5F" w:color="auto" w:val="clear"/>
-            <w:tcMar>
-              <w:top w:type="dxa" w:w="70"/>
-              <w:left w:type="dxa" w:w="90"/>
-              <w:bottom w:type="dxa" w:w="70"/>
-              <w:right w:type="dxa" w:w="90"/>
-            </w:tcMar>
-          </w:tcPr>
-          <w:p>
-            <w:r>
-              <w:rPr>
-                <w:rFonts w:ascii="Arial" w:cs="Arial" w:eastAsia="Arial" w:hAnsi="Arial"/>
-                <w:b/>
-                <w:bCs/>
-                <w:color w:val="FFFFFF"/>
+              <w:top w:val="single" w:color="8C8C8C" w:sz="4"/>
+              <w:left w:val="single" w:color="8C8C8C" w:sz="4"/>
+              <w:bottom w:val="single" w:color="8C8C8C" w:sz="4"/>
+              <w:right w:val="single" w:color="8C8C8C" w:sz="4"/>
+            </w:tcBorders>
+            <w:tcMar>
+              <w:top w:type="dxa" w:w="70"/>
+              <w:left w:type="dxa" w:w="90"/>
+              <w:bottom w:type="dxa" w:w="70"/>
+              <w:right w:type="dxa" w:w="90"/>
+            </w:tcMar>
+          </w:tcPr>
+          <w:p>
+            <w:r>
+              <w:rPr>
+                <w:rFonts w:ascii="Arial" w:cs="Arial" w:eastAsia="Arial" w:hAnsi="Arial"/>
+                <w:b/>
+                <w:bCs/>
+                <w:color w:val="1B1B1B"/>
                 <w:sz w:val="18"/>
                 <w:szCs w:val="18"/>
               </w:rPr>
@@ -3985,10 +3965,10 @@
           <w:tcPr>
             <w:tcW w:type="dxa" w:w="1880"/>
             <w:tcBorders>
-              <w:top w:val="single" w:color="8FA3AA" w:sz="4"/>
-              <w:left w:val="single" w:color="8FA3AA" w:sz="4"/>
-              <w:bottom w:val="single" w:color="8FA3AA" w:sz="4"/>
-              <w:right w:val="single" w:color="8FA3AA" w:sz="4"/>
+              <w:top w:val="single" w:color="8C8C8C" w:sz="4"/>
+              <w:left w:val="single" w:color="8C8C8C" w:sz="4"/>
+              <w:bottom w:val="single" w:color="8C8C8C" w:sz="4"/>
+              <w:right w:val="single" w:color="8C8C8C" w:sz="4"/>
             </w:tcBorders>
             <w:tcMar>
               <w:top w:type="dxa" w:w="70"/>
@@ -4025,10 +4005,10 @@
           <w:tcPr>
             <w:tcW w:type="dxa" w:w="2280"/>
             <w:tcBorders>
-              <w:top w:val="single" w:color="8FA3AA" w:sz="4"/>
-              <w:left w:val="single" w:color="8FA3AA" w:sz="4"/>
-              <w:bottom w:val="single" w:color="8FA3AA" w:sz="4"/>
-              <w:right w:val="single" w:color="8FA3AA" w:sz="4"/>
+              <w:top w:val="single" w:color="8C8C8C" w:sz="4"/>
+              <w:left w:val="single" w:color="8C8C8C" w:sz="4"/>
+              <w:bottom w:val="single" w:color="8C8C8C" w:sz="4"/>
+              <w:right w:val="single" w:color="8C8C8C" w:sz="4"/>
             </w:tcBorders>
             <w:tcMar>
               <w:top w:type="dxa" w:w="70"/>
@@ -4055,10 +4035,10 @@
           <w:tcPr>
             <w:tcW w:type="dxa" w:w="2550"/>
             <w:tcBorders>
-              <w:top w:val="single" w:color="8FA3AA" w:sz="4"/>
-              <w:left w:val="single" w:color="8FA3AA" w:sz="4"/>
-              <w:bottom w:val="single" w:color="8FA3AA" w:sz="4"/>
-              <w:right w:val="single" w:color="8FA3AA" w:sz="4"/>
+              <w:top w:val="single" w:color="8C8C8C" w:sz="4"/>
+              <w:left w:val="single" w:color="8C8C8C" w:sz="4"/>
+              <w:bottom w:val="single" w:color="8C8C8C" w:sz="4"/>
+              <w:right w:val="single" w:color="8C8C8C" w:sz="4"/>
             </w:tcBorders>
             <w:tcMar>
               <w:top w:type="dxa" w:w="70"/>
@@ -4098,10 +4078,10 @@
           <w:tcPr>
             <w:tcW w:type="dxa" w:w="2302"/>
             <w:tcBorders>
-              <w:top w:val="single" w:color="8FA3AA" w:sz="4"/>
-              <w:left w:val="single" w:color="8FA3AA" w:sz="4"/>
-              <w:bottom w:val="single" w:color="8FA3AA" w:sz="4"/>
-              <w:right w:val="single" w:color="8FA3AA" w:sz="4"/>
+              <w:top w:val="single" w:color="8C8C8C" w:sz="4"/>
+              <w:left w:val="single" w:color="8C8C8C" w:sz="4"/>
+              <w:bottom w:val="single" w:color="8C8C8C" w:sz="4"/>
+              <w:right w:val="single" w:color="8C8C8C" w:sz="4"/>
             </w:tcBorders>
             <w:tcMar>
               <w:top w:type="dxa" w:w="70"/>
@@ -4212,26 +4192,25 @@
           <w:tcPr>
             <w:tcW w:type="dxa" w:w="1500"/>
             <w:tcBorders>
-              <w:top w:val="single" w:color="8FA3AA" w:sz="4"/>
-              <w:left w:val="single" w:color="8FA3AA" w:sz="4"/>
-              <w:bottom w:val="single" w:color="8FA3AA" w:sz="4"/>
-              <w:right w:val="single" w:color="8FA3AA" w:sz="4"/>
-            </w:tcBorders>
-            <w:shd w:fill="1F4E5F" w:color="auto" w:val="clear"/>
-            <w:tcMar>
-              <w:top w:type="dxa" w:w="70"/>
-              <w:left w:type="dxa" w:w="90"/>
-              <w:bottom w:type="dxa" w:w="70"/>
-              <w:right w:type="dxa" w:w="90"/>
-            </w:tcMar>
-          </w:tcPr>
-          <w:p>
-            <w:r>
-              <w:rPr>
-                <w:rFonts w:ascii="Arial" w:cs="Arial" w:eastAsia="Arial" w:hAnsi="Arial"/>
-                <w:b/>
-                <w:bCs/>
-                <w:color w:val="FFFFFF"/>
+              <w:top w:val="single" w:color="8C8C8C" w:sz="4"/>
+              <w:left w:val="single" w:color="8C8C8C" w:sz="4"/>
+              <w:bottom w:val="single" w:color="8C8C8C" w:sz="4"/>
+              <w:right w:val="single" w:color="8C8C8C" w:sz="4"/>
+            </w:tcBorders>
+            <w:tcMar>
+              <w:top w:type="dxa" w:w="70"/>
+              <w:left w:type="dxa" w:w="90"/>
+              <w:bottom w:type="dxa" w:w="70"/>
+              <w:right w:type="dxa" w:w="90"/>
+            </w:tcMar>
+          </w:tcPr>
+          <w:p>
+            <w:r>
+              <w:rPr>
+                <w:rFonts w:ascii="Arial" w:cs="Arial" w:eastAsia="Arial" w:hAnsi="Arial"/>
+                <w:b/>
+                <w:bCs/>
+                <w:color w:val="1B1B1B"/>
                 <w:sz w:val="18"/>
                 <w:szCs w:val="18"/>
               </w:rPr>
@@ -4243,10 +4222,10 @@
           <w:tcPr>
             <w:tcW w:type="dxa" w:w="1880"/>
             <w:tcBorders>
-              <w:top w:val="single" w:color="8FA3AA" w:sz="4"/>
-              <w:left w:val="single" w:color="8FA3AA" w:sz="4"/>
-              <w:bottom w:val="single" w:color="8FA3AA" w:sz="4"/>
-              <w:right w:val="single" w:color="8FA3AA" w:sz="4"/>
+              <w:top w:val="single" w:color="8C8C8C" w:sz="4"/>
+              <w:left w:val="single" w:color="8C8C8C" w:sz="4"/>
+              <w:bottom w:val="single" w:color="8C8C8C" w:sz="4"/>
+              <w:right w:val="single" w:color="8C8C8C" w:sz="4"/>
             </w:tcBorders>
             <w:tcMar>
               <w:top w:type="dxa" w:w="70"/>
@@ -4283,10 +4262,10 @@
           <w:tcPr>
             <w:tcW w:type="dxa" w:w="2280"/>
             <w:tcBorders>
-              <w:top w:val="single" w:color="8FA3AA" w:sz="4"/>
-              <w:left w:val="single" w:color="8FA3AA" w:sz="4"/>
-              <w:bottom w:val="single" w:color="8FA3AA" w:sz="4"/>
-              <w:right w:val="single" w:color="8FA3AA" w:sz="4"/>
+              <w:top w:val="single" w:color="8C8C8C" w:sz="4"/>
+              <w:left w:val="single" w:color="8C8C8C" w:sz="4"/>
+              <w:bottom w:val="single" w:color="8C8C8C" w:sz="4"/>
+              <w:right w:val="single" w:color="8C8C8C" w:sz="4"/>
             </w:tcBorders>
             <w:tcMar>
               <w:top w:type="dxa" w:w="70"/>
@@ -4326,10 +4305,10 @@
           <w:tcPr>
             <w:tcW w:type="dxa" w:w="2550"/>
             <w:tcBorders>
-              <w:top w:val="single" w:color="8FA3AA" w:sz="4"/>
-              <w:left w:val="single" w:color="8FA3AA" w:sz="4"/>
-              <w:bottom w:val="single" w:color="8FA3AA" w:sz="4"/>
-              <w:right w:val="single" w:color="8FA3AA" w:sz="4"/>
+              <w:top w:val="single" w:color="8C8C8C" w:sz="4"/>
+              <w:left w:val="single" w:color="8C8C8C" w:sz="4"/>
+              <w:bottom w:val="single" w:color="8C8C8C" w:sz="4"/>
+              <w:right w:val="single" w:color="8C8C8C" w:sz="4"/>
             </w:tcBorders>
             <w:tcMar>
               <w:top w:type="dxa" w:w="70"/>
@@ -4369,10 +4348,10 @@
           <w:tcPr>
             <w:tcW w:type="dxa" w:w="2302"/>
             <w:tcBorders>
-              <w:top w:val="single" w:color="8FA3AA" w:sz="4"/>
-              <w:left w:val="single" w:color="8FA3AA" w:sz="4"/>
-              <w:bottom w:val="single" w:color="8FA3AA" w:sz="4"/>
-              <w:right w:val="single" w:color="8FA3AA" w:sz="4"/>
+              <w:top w:val="single" w:color="8C8C8C" w:sz="4"/>
+              <w:left w:val="single" w:color="8C8C8C" w:sz="4"/>
+              <w:bottom w:val="single" w:color="8C8C8C" w:sz="4"/>
+              <w:right w:val="single" w:color="8C8C8C" w:sz="4"/>
             </w:tcBorders>
             <w:tcMar>
               <w:top w:type="dxa" w:w="70"/>
@@ -4483,26 +4462,25 @@
           <w:tcPr>
             <w:tcW w:type="dxa" w:w="1500"/>
             <w:tcBorders>
-              <w:top w:val="single" w:color="8FA3AA" w:sz="4"/>
-              <w:left w:val="single" w:color="8FA3AA" w:sz="4"/>
-              <w:bottom w:val="single" w:color="8FA3AA" w:sz="4"/>
-              <w:right w:val="single" w:color="8FA3AA" w:sz="4"/>
-            </w:tcBorders>
-            <w:shd w:fill="1F4E5F" w:color="auto" w:val="clear"/>
-            <w:tcMar>
-              <w:top w:type="dxa" w:w="70"/>
-              <w:left w:type="dxa" w:w="90"/>
-              <w:bottom w:type="dxa" w:w="70"/>
-              <w:right w:type="dxa" w:w="90"/>
-            </w:tcMar>
-          </w:tcPr>
-          <w:p>
-            <w:r>
-              <w:rPr>
-                <w:rFonts w:ascii="Arial" w:cs="Arial" w:eastAsia="Arial" w:hAnsi="Arial"/>
-                <w:b/>
-                <w:bCs/>
-                <w:color w:val="FFFFFF"/>
+              <w:top w:val="single" w:color="8C8C8C" w:sz="4"/>
+              <w:left w:val="single" w:color="8C8C8C" w:sz="4"/>
+              <w:bottom w:val="single" w:color="8C8C8C" w:sz="4"/>
+              <w:right w:val="single" w:color="8C8C8C" w:sz="4"/>
+            </w:tcBorders>
+            <w:tcMar>
+              <w:top w:type="dxa" w:w="70"/>
+              <w:left w:type="dxa" w:w="90"/>
+              <w:bottom w:type="dxa" w:w="70"/>
+              <w:right w:type="dxa" w:w="90"/>
+            </w:tcMar>
+          </w:tcPr>
+          <w:p>
+            <w:r>
+              <w:rPr>
+                <w:rFonts w:ascii="Arial" w:cs="Arial" w:eastAsia="Arial" w:hAnsi="Arial"/>
+                <w:b/>
+                <w:bCs/>
+                <w:color w:val="1B1B1B"/>
                 <w:sz w:val="18"/>
                 <w:szCs w:val="18"/>
               </w:rPr>
@@ -4514,10 +4492,10 @@
           <w:tcPr>
             <w:tcW w:type="dxa" w:w="1880"/>
             <w:tcBorders>
-              <w:top w:val="single" w:color="8FA3AA" w:sz="4"/>
-              <w:left w:val="single" w:color="8FA3AA" w:sz="4"/>
-              <w:bottom w:val="single" w:color="8FA3AA" w:sz="4"/>
-              <w:right w:val="single" w:color="8FA3AA" w:sz="4"/>
+              <w:top w:val="single" w:color="8C8C8C" w:sz="4"/>
+              <w:left w:val="single" w:color="8C8C8C" w:sz="4"/>
+              <w:bottom w:val="single" w:color="8C8C8C" w:sz="4"/>
+              <w:right w:val="single" w:color="8C8C8C" w:sz="4"/>
             </w:tcBorders>
             <w:tcMar>
               <w:top w:type="dxa" w:w="70"/>
@@ -4554,10 +4532,10 @@
           <w:tcPr>
             <w:tcW w:type="dxa" w:w="2280"/>
             <w:tcBorders>
-              <w:top w:val="single" w:color="8FA3AA" w:sz="4"/>
-              <w:left w:val="single" w:color="8FA3AA" w:sz="4"/>
-              <w:bottom w:val="single" w:color="8FA3AA" w:sz="4"/>
-              <w:right w:val="single" w:color="8FA3AA" w:sz="4"/>
+              <w:top w:val="single" w:color="8C8C8C" w:sz="4"/>
+              <w:left w:val="single" w:color="8C8C8C" w:sz="4"/>
+              <w:bottom w:val="single" w:color="8C8C8C" w:sz="4"/>
+              <w:right w:val="single" w:color="8C8C8C" w:sz="4"/>
             </w:tcBorders>
             <w:tcMar>
               <w:top w:type="dxa" w:w="70"/>
@@ -4597,10 +4575,10 @@
           <w:tcPr>
             <w:tcW w:type="dxa" w:w="2550"/>
             <w:tcBorders>
-              <w:top w:val="single" w:color="8FA3AA" w:sz="4"/>
-              <w:left w:val="single" w:color="8FA3AA" w:sz="4"/>
-              <w:bottom w:val="single" w:color="8FA3AA" w:sz="4"/>
-              <w:right w:val="single" w:color="8FA3AA" w:sz="4"/>
+              <w:top w:val="single" w:color="8C8C8C" w:sz="4"/>
+              <w:left w:val="single" w:color="8C8C8C" w:sz="4"/>
+              <w:bottom w:val="single" w:color="8C8C8C" w:sz="4"/>
+              <w:right w:val="single" w:color="8C8C8C" w:sz="4"/>
             </w:tcBorders>
             <w:tcMar>
               <w:top w:type="dxa" w:w="70"/>
@@ -4640,10 +4618,10 @@
           <w:tcPr>
             <w:tcW w:type="dxa" w:w="2302"/>
             <w:tcBorders>
-              <w:top w:val="single" w:color="8FA3AA" w:sz="4"/>
-              <w:left w:val="single" w:color="8FA3AA" w:sz="4"/>
-              <w:bottom w:val="single" w:color="8FA3AA" w:sz="4"/>
-              <w:right w:val="single" w:color="8FA3AA" w:sz="4"/>
+              <w:top w:val="single" w:color="8C8C8C" w:sz="4"/>
+              <w:left w:val="single" w:color="8C8C8C" w:sz="4"/>
+              <w:bottom w:val="single" w:color="8C8C8C" w:sz="4"/>
+              <w:right w:val="single" w:color="8C8C8C" w:sz="4"/>
             </w:tcBorders>
             <w:tcMar>
               <w:top w:type="dxa" w:w="70"/>
@@ -4754,26 +4732,25 @@
           <w:tcPr>
             <w:tcW w:type="dxa" w:w="1500"/>
             <w:tcBorders>
-              <w:top w:val="single" w:color="8FA3AA" w:sz="4"/>
-              <w:left w:val="single" w:color="8FA3AA" w:sz="4"/>
-              <w:bottom w:val="single" w:color="8FA3AA" w:sz="4"/>
-              <w:right w:val="single" w:color="8FA3AA" w:sz="4"/>
-            </w:tcBorders>
-            <w:shd w:fill="1F4E5F" w:color="auto" w:val="clear"/>
-            <w:tcMar>
-              <w:top w:type="dxa" w:w="70"/>
-              <w:left w:type="dxa" w:w="90"/>
-              <w:bottom w:type="dxa" w:w="70"/>
-              <w:right w:type="dxa" w:w="90"/>
-            </w:tcMar>
-          </w:tcPr>
-          <w:p>
-            <w:r>
-              <w:rPr>
-                <w:rFonts w:ascii="Arial" w:cs="Arial" w:eastAsia="Arial" w:hAnsi="Arial"/>
-                <w:b/>
-                <w:bCs/>
-                <w:color w:val="FFFFFF"/>
+              <w:top w:val="single" w:color="8C8C8C" w:sz="4"/>
+              <w:left w:val="single" w:color="8C8C8C" w:sz="4"/>
+              <w:bottom w:val="single" w:color="8C8C8C" w:sz="4"/>
+              <w:right w:val="single" w:color="8C8C8C" w:sz="4"/>
+            </w:tcBorders>
+            <w:tcMar>
+              <w:top w:type="dxa" w:w="70"/>
+              <w:left w:type="dxa" w:w="90"/>
+              <w:bottom w:type="dxa" w:w="70"/>
+              <w:right w:type="dxa" w:w="90"/>
+            </w:tcMar>
+          </w:tcPr>
+          <w:p>
+            <w:r>
+              <w:rPr>
+                <w:rFonts w:ascii="Arial" w:cs="Arial" w:eastAsia="Arial" w:hAnsi="Arial"/>
+                <w:b/>
+                <w:bCs/>
+                <w:color w:val="1B1B1B"/>
                 <w:sz w:val="18"/>
                 <w:szCs w:val="18"/>
               </w:rPr>
@@ -4785,10 +4762,10 @@
           <w:tcPr>
             <w:tcW w:type="dxa" w:w="1880"/>
             <w:tcBorders>
-              <w:top w:val="single" w:color="8FA3AA" w:sz="4"/>
-              <w:left w:val="single" w:color="8FA3AA" w:sz="4"/>
-              <w:bottom w:val="single" w:color="8FA3AA" w:sz="4"/>
-              <w:right w:val="single" w:color="8FA3AA" w:sz="4"/>
+              <w:top w:val="single" w:color="8C8C8C" w:sz="4"/>
+              <w:left w:val="single" w:color="8C8C8C" w:sz="4"/>
+              <w:bottom w:val="single" w:color="8C8C8C" w:sz="4"/>
+              <w:right w:val="single" w:color="8C8C8C" w:sz="4"/>
             </w:tcBorders>
             <w:tcMar>
               <w:top w:type="dxa" w:w="70"/>
@@ -4825,10 +4802,10 @@
           <w:tcPr>
             <w:tcW w:type="dxa" w:w="2280"/>
             <w:tcBorders>
-              <w:top w:val="single" w:color="8FA3AA" w:sz="4"/>
-              <w:left w:val="single" w:color="8FA3AA" w:sz="4"/>
-              <w:bottom w:val="single" w:color="8FA3AA" w:sz="4"/>
-              <w:right w:val="single" w:color="8FA3AA" w:sz="4"/>
+              <w:top w:val="single" w:color="8C8C8C" w:sz="4"/>
+              <w:left w:val="single" w:color="8C8C8C" w:sz="4"/>
+              <w:bottom w:val="single" w:color="8C8C8C" w:sz="4"/>
+              <w:right w:val="single" w:color="8C8C8C" w:sz="4"/>
             </w:tcBorders>
             <w:tcMar>
               <w:top w:type="dxa" w:w="70"/>
@@ -4855,10 +4832,10 @@
           <w:tcPr>
             <w:tcW w:type="dxa" w:w="2550"/>
             <w:tcBorders>
-              <w:top w:val="single" w:color="8FA3AA" w:sz="4"/>
-              <w:left w:val="single" w:color="8FA3AA" w:sz="4"/>
-              <w:bottom w:val="single" w:color="8FA3AA" w:sz="4"/>
-              <w:right w:val="single" w:color="8FA3AA" w:sz="4"/>
+              <w:top w:val="single" w:color="8C8C8C" w:sz="4"/>
+              <w:left w:val="single" w:color="8C8C8C" w:sz="4"/>
+              <w:bottom w:val="single" w:color="8C8C8C" w:sz="4"/>
+              <w:right w:val="single" w:color="8C8C8C" w:sz="4"/>
             </w:tcBorders>
             <w:tcMar>
               <w:top w:type="dxa" w:w="70"/>
@@ -4898,10 +4875,10 @@
           <w:tcPr>
             <w:tcW w:type="dxa" w:w="2302"/>
             <w:tcBorders>
-              <w:top w:val="single" w:color="8FA3AA" w:sz="4"/>
-              <w:left w:val="single" w:color="8FA3AA" w:sz="4"/>
-              <w:bottom w:val="single" w:color="8FA3AA" w:sz="4"/>
-              <w:right w:val="single" w:color="8FA3AA" w:sz="4"/>
+              <w:top w:val="single" w:color="8C8C8C" w:sz="4"/>
+              <w:left w:val="single" w:color="8C8C8C" w:sz="4"/>
+              <w:bottom w:val="single" w:color="8C8C8C" w:sz="4"/>
+              <w:right w:val="single" w:color="8C8C8C" w:sz="4"/>
             </w:tcBorders>
             <w:tcMar>
               <w:top w:type="dxa" w:w="70"/>
@@ -5012,26 +4989,25 @@
           <w:tcPr>
             <w:tcW w:type="dxa" w:w="1500"/>
             <w:tcBorders>
-              <w:top w:val="single" w:color="8FA3AA" w:sz="4"/>
-              <w:left w:val="single" w:color="8FA3AA" w:sz="4"/>
-              <w:bottom w:val="single" w:color="8FA3AA" w:sz="4"/>
-              <w:right w:val="single" w:color="8FA3AA" w:sz="4"/>
-            </w:tcBorders>
-            <w:shd w:fill="1F4E5F" w:color="auto" w:val="clear"/>
-            <w:tcMar>
-              <w:top w:type="dxa" w:w="70"/>
-              <w:left w:type="dxa" w:w="90"/>
-              <w:bottom w:type="dxa" w:w="70"/>
-              <w:right w:type="dxa" w:w="90"/>
-            </w:tcMar>
-          </w:tcPr>
-          <w:p>
-            <w:r>
-              <w:rPr>
-                <w:rFonts w:ascii="Arial" w:cs="Arial" w:eastAsia="Arial" w:hAnsi="Arial"/>
-                <w:b/>
-                <w:bCs/>
-                <w:color w:val="FFFFFF"/>
+              <w:top w:val="single" w:color="8C8C8C" w:sz="4"/>
+              <w:left w:val="single" w:color="8C8C8C" w:sz="4"/>
+              <w:bottom w:val="single" w:color="8C8C8C" w:sz="4"/>
+              <w:right w:val="single" w:color="8C8C8C" w:sz="4"/>
+            </w:tcBorders>
+            <w:tcMar>
+              <w:top w:type="dxa" w:w="70"/>
+              <w:left w:type="dxa" w:w="90"/>
+              <w:bottom w:type="dxa" w:w="70"/>
+              <w:right w:type="dxa" w:w="90"/>
+            </w:tcMar>
+          </w:tcPr>
+          <w:p>
+            <w:r>
+              <w:rPr>
+                <w:rFonts w:ascii="Arial" w:cs="Arial" w:eastAsia="Arial" w:hAnsi="Arial"/>
+                <w:b/>
+                <w:bCs/>
+                <w:color w:val="1B1B1B"/>
                 <w:sz w:val="18"/>
                 <w:szCs w:val="18"/>
               </w:rPr>
@@ -5043,10 +5019,10 @@
           <w:tcPr>
             <w:tcW w:type="dxa" w:w="1880"/>
             <w:tcBorders>
-              <w:top w:val="single" w:color="8FA3AA" w:sz="4"/>
-              <w:left w:val="single" w:color="8FA3AA" w:sz="4"/>
-              <w:bottom w:val="single" w:color="8FA3AA" w:sz="4"/>
-              <w:right w:val="single" w:color="8FA3AA" w:sz="4"/>
+              <w:top w:val="single" w:color="8C8C8C" w:sz="4"/>
+              <w:left w:val="single" w:color="8C8C8C" w:sz="4"/>
+              <w:bottom w:val="single" w:color="8C8C8C" w:sz="4"/>
+              <w:right w:val="single" w:color="8C8C8C" w:sz="4"/>
             </w:tcBorders>
             <w:tcMar>
               <w:top w:type="dxa" w:w="70"/>
@@ -5083,10 +5059,10 @@
           <w:tcPr>
             <w:tcW w:type="dxa" w:w="2280"/>
             <w:tcBorders>
-              <w:top w:val="single" w:color="8FA3AA" w:sz="4"/>
-              <w:left w:val="single" w:color="8FA3AA" w:sz="4"/>
-              <w:bottom w:val="single" w:color="8FA3AA" w:sz="4"/>
-              <w:right w:val="single" w:color="8FA3AA" w:sz="4"/>
+              <w:top w:val="single" w:color="8C8C8C" w:sz="4"/>
+              <w:left w:val="single" w:color="8C8C8C" w:sz="4"/>
+              <w:bottom w:val="single" w:color="8C8C8C" w:sz="4"/>
+              <w:right w:val="single" w:color="8C8C8C" w:sz="4"/>
             </w:tcBorders>
             <w:tcMar>
               <w:top w:type="dxa" w:w="70"/>
@@ -5113,10 +5089,10 @@
           <w:tcPr>
             <w:tcW w:type="dxa" w:w="2550"/>
             <w:tcBorders>
-              <w:top w:val="single" w:color="8FA3AA" w:sz="4"/>
-              <w:left w:val="single" w:color="8FA3AA" w:sz="4"/>
-              <w:bottom w:val="single" w:color="8FA3AA" w:sz="4"/>
-              <w:right w:val="single" w:color="8FA3AA" w:sz="4"/>
+              <w:top w:val="single" w:color="8C8C8C" w:sz="4"/>
+              <w:left w:val="single" w:color="8C8C8C" w:sz="4"/>
+              <w:bottom w:val="single" w:color="8C8C8C" w:sz="4"/>
+              <w:right w:val="single" w:color="8C8C8C" w:sz="4"/>
             </w:tcBorders>
             <w:tcMar>
               <w:top w:type="dxa" w:w="70"/>
@@ -5143,10 +5119,10 @@
           <w:tcPr>
             <w:tcW w:type="dxa" w:w="2302"/>
             <w:tcBorders>
-              <w:top w:val="single" w:color="8FA3AA" w:sz="4"/>
-              <w:left w:val="single" w:color="8FA3AA" w:sz="4"/>
-              <w:bottom w:val="single" w:color="8FA3AA" w:sz="4"/>
-              <w:right w:val="single" w:color="8FA3AA" w:sz="4"/>
+              <w:top w:val="single" w:color="8C8C8C" w:sz="4"/>
+              <w:left w:val="single" w:color="8C8C8C" w:sz="4"/>
+              <w:bottom w:val="single" w:color="8C8C8C" w:sz="4"/>
+              <w:right w:val="single" w:color="8C8C8C" w:sz="4"/>
             </w:tcBorders>
             <w:tcMar>
               <w:top w:type="dxa" w:w="70"/>
@@ -5262,7 +5238,7 @@
           <w:rFonts w:ascii="Arial" w:cs="Arial" w:eastAsia="Arial" w:hAnsi="Arial"/>
           <w:b/>
           <w:bCs/>
-          <w:color w:val="1F4E5F"/>
+          <w:color w:val="1B1B1B"/>
           <w:sz w:val="24"/>
           <w:szCs w:val="24"/>
         </w:rPr>
@@ -5273,12 +5249,12 @@
       <w:tblPr>
         <w:tblW w:type="dxa" w:w="10512"/>
         <w:tblBorders>
-          <w:top w:val="single" w:color="auto" w:sz="4"/>
-          <w:left w:val="single" w:color="auto" w:sz="4"/>
-          <w:bottom w:val="single" w:color="auto" w:sz="4"/>
-          <w:right w:val="single" w:color="auto" w:sz="4"/>
-          <w:insideH w:val="single" w:color="auto" w:sz="4"/>
-          <w:insideV w:val="single" w:color="auto" w:sz="4"/>
+          <w:top w:val="single" w:color="8C8C8C" w:sz="4"/>
+          <w:left w:val="single" w:color="8C8C8C" w:sz="4"/>
+          <w:bottom w:val="single" w:color="8C8C8C" w:sz="4"/>
+          <w:right w:val="single" w:color="8C8C8C" w:sz="4"/>
+          <w:insideH w:val="single" w:color="8C8C8C" w:sz="4"/>
+          <w:insideV w:val="single" w:color="8C8C8C" w:sz="4"/>
         </w:tblBorders>
       </w:tblPr>
       <w:tblGrid>
@@ -5293,26 +5269,25 @@
           <w:tcPr>
             <w:tcW w:type="dxa" w:w="2200"/>
             <w:tcBorders>
-              <w:top w:val="single" w:color="8FA3AA" w:sz="4"/>
-              <w:left w:val="single" w:color="8FA3AA" w:sz="4"/>
-              <w:bottom w:val="single" w:color="8FA3AA" w:sz="4"/>
-              <w:right w:val="single" w:color="8FA3AA" w:sz="4"/>
-            </w:tcBorders>
-            <w:shd w:fill="1F4E5F" w:color="auto" w:val="clear"/>
-            <w:tcMar>
-              <w:top w:type="dxa" w:w="70"/>
-              <w:left w:type="dxa" w:w="90"/>
-              <w:bottom w:type="dxa" w:w="70"/>
-              <w:right w:type="dxa" w:w="90"/>
-            </w:tcMar>
-          </w:tcPr>
-          <w:p>
-            <w:r>
-              <w:rPr>
-                <w:rFonts w:ascii="Arial" w:cs="Arial" w:eastAsia="Arial" w:hAnsi="Arial"/>
-                <w:b/>
-                <w:bCs/>
-                <w:color w:val="FFFFFF"/>
+              <w:top w:val="single" w:color="8C8C8C" w:sz="4"/>
+              <w:left w:val="single" w:color="8C8C8C" w:sz="4"/>
+              <w:bottom w:val="single" w:color="8C8C8C" w:sz="4"/>
+              <w:right w:val="single" w:color="8C8C8C" w:sz="4"/>
+            </w:tcBorders>
+            <w:tcMar>
+              <w:top w:type="dxa" w:w="70"/>
+              <w:left w:type="dxa" w:w="90"/>
+              <w:bottom w:type="dxa" w:w="70"/>
+              <w:right w:type="dxa" w:w="90"/>
+            </w:tcMar>
+          </w:tcPr>
+          <w:p>
+            <w:r>
+              <w:rPr>
+                <w:rFonts w:ascii="Arial" w:cs="Arial" w:eastAsia="Arial" w:hAnsi="Arial"/>
+                <w:b/>
+                <w:bCs/>
+                <w:color w:val="1B1B1B"/>
                 <w:sz w:val="18"/>
                 <w:szCs w:val="18"/>
               </w:rPr>
@@ -5324,10 +5299,10 @@
           <w:tcPr>
             <w:tcW w:type="dxa" w:w="8312"/>
             <w:tcBorders>
-              <w:top w:val="single" w:color="8FA3AA" w:sz="4"/>
-              <w:left w:val="single" w:color="8FA3AA" w:sz="4"/>
-              <w:bottom w:val="single" w:color="8FA3AA" w:sz="4"/>
-              <w:right w:val="single" w:color="8FA3AA" w:sz="4"/>
+              <w:top w:val="single" w:color="8C8C8C" w:sz="4"/>
+              <w:left w:val="single" w:color="8C8C8C" w:sz="4"/>
+              <w:bottom w:val="single" w:color="8C8C8C" w:sz="4"/>
+              <w:right w:val="single" w:color="8C8C8C" w:sz="4"/>
             </w:tcBorders>
             <w:tcMar>
               <w:top w:type="dxa" w:w="70"/>
@@ -5385,26 +5360,25 @@
           <w:tcPr>
             <w:tcW w:type="dxa" w:w="2200"/>
             <w:tcBorders>
-              <w:top w:val="single" w:color="8FA3AA" w:sz="4"/>
-              <w:left w:val="single" w:color="8FA3AA" w:sz="4"/>
-              <w:bottom w:val="single" w:color="8FA3AA" w:sz="4"/>
-              <w:right w:val="single" w:color="8FA3AA" w:sz="4"/>
-            </w:tcBorders>
-            <w:shd w:fill="1F4E5F" w:color="auto" w:val="clear"/>
-            <w:tcMar>
-              <w:top w:type="dxa" w:w="70"/>
-              <w:left w:type="dxa" w:w="90"/>
-              <w:bottom w:type="dxa" w:w="70"/>
-              <w:right w:type="dxa" w:w="90"/>
-            </w:tcMar>
-          </w:tcPr>
-          <w:p>
-            <w:r>
-              <w:rPr>
-                <w:rFonts w:ascii="Arial" w:cs="Arial" w:eastAsia="Arial" w:hAnsi="Arial"/>
-                <w:b/>
-                <w:bCs/>
-                <w:color w:val="FFFFFF"/>
+              <w:top w:val="single" w:color="8C8C8C" w:sz="4"/>
+              <w:left w:val="single" w:color="8C8C8C" w:sz="4"/>
+              <w:bottom w:val="single" w:color="8C8C8C" w:sz="4"/>
+              <w:right w:val="single" w:color="8C8C8C" w:sz="4"/>
+            </w:tcBorders>
+            <w:tcMar>
+              <w:top w:type="dxa" w:w="70"/>
+              <w:left w:type="dxa" w:w="90"/>
+              <w:bottom w:type="dxa" w:w="70"/>
+              <w:right w:type="dxa" w:w="90"/>
+            </w:tcMar>
+          </w:tcPr>
+          <w:p>
+            <w:r>
+              <w:rPr>
+                <w:rFonts w:ascii="Arial" w:cs="Arial" w:eastAsia="Arial" w:hAnsi="Arial"/>
+                <w:b/>
+                <w:bCs/>
+                <w:color w:val="1B1B1B"/>
                 <w:sz w:val="18"/>
                 <w:szCs w:val="18"/>
               </w:rPr>
@@ -5416,10 +5390,10 @@
           <w:tcPr>
             <w:tcW w:type="dxa" w:w="8312"/>
             <w:tcBorders>
-              <w:top w:val="single" w:color="8FA3AA" w:sz="4"/>
-              <w:left w:val="single" w:color="8FA3AA" w:sz="4"/>
-              <w:bottom w:val="single" w:color="8FA3AA" w:sz="4"/>
-              <w:right w:val="single" w:color="8FA3AA" w:sz="4"/>
+              <w:top w:val="single" w:color="8C8C8C" w:sz="4"/>
+              <w:left w:val="single" w:color="8C8C8C" w:sz="4"/>
+              <w:bottom w:val="single" w:color="8C8C8C" w:sz="4"/>
+              <w:right w:val="single" w:color="8C8C8C" w:sz="4"/>
             </w:tcBorders>
             <w:tcMar>
               <w:top w:type="dxa" w:w="70"/>
@@ -5464,26 +5438,25 @@
           <w:tcPr>
             <w:tcW w:type="dxa" w:w="2200"/>
             <w:tcBorders>
-              <w:top w:val="single" w:color="8FA3AA" w:sz="4"/>
-              <w:left w:val="single" w:color="8FA3AA" w:sz="4"/>
-              <w:bottom w:val="single" w:color="8FA3AA" w:sz="4"/>
-              <w:right w:val="single" w:color="8FA3AA" w:sz="4"/>
-            </w:tcBorders>
-            <w:shd w:fill="1F4E5F" w:color="auto" w:val="clear"/>
-            <w:tcMar>
-              <w:top w:type="dxa" w:w="70"/>
-              <w:left w:type="dxa" w:w="90"/>
-              <w:bottom w:type="dxa" w:w="70"/>
-              <w:right w:type="dxa" w:w="90"/>
-            </w:tcMar>
-          </w:tcPr>
-          <w:p>
-            <w:r>
-              <w:rPr>
-                <w:rFonts w:ascii="Arial" w:cs="Arial" w:eastAsia="Arial" w:hAnsi="Arial"/>
-                <w:b/>
-                <w:bCs/>
-                <w:color w:val="FFFFFF"/>
+              <w:top w:val="single" w:color="8C8C8C" w:sz="4"/>
+              <w:left w:val="single" w:color="8C8C8C" w:sz="4"/>
+              <w:bottom w:val="single" w:color="8C8C8C" w:sz="4"/>
+              <w:right w:val="single" w:color="8C8C8C" w:sz="4"/>
+            </w:tcBorders>
+            <w:tcMar>
+              <w:top w:type="dxa" w:w="70"/>
+              <w:left w:type="dxa" w:w="90"/>
+              <w:bottom w:type="dxa" w:w="70"/>
+              <w:right w:type="dxa" w:w="90"/>
+            </w:tcMar>
+          </w:tcPr>
+          <w:p>
+            <w:r>
+              <w:rPr>
+                <w:rFonts w:ascii="Arial" w:cs="Arial" w:eastAsia="Arial" w:hAnsi="Arial"/>
+                <w:b/>
+                <w:bCs/>
+                <w:color w:val="1B1B1B"/>
                 <w:sz w:val="18"/>
                 <w:szCs w:val="18"/>
               </w:rPr>
@@ -5495,10 +5468,10 @@
           <w:tcPr>
             <w:tcW w:type="dxa" w:w="8312"/>
             <w:tcBorders>
-              <w:top w:val="single" w:color="8FA3AA" w:sz="4"/>
-              <w:left w:val="single" w:color="8FA3AA" w:sz="4"/>
-              <w:bottom w:val="single" w:color="8FA3AA" w:sz="4"/>
-              <w:right w:val="single" w:color="8FA3AA" w:sz="4"/>
+              <w:top w:val="single" w:color="8C8C8C" w:sz="4"/>
+              <w:left w:val="single" w:color="8C8C8C" w:sz="4"/>
+              <w:bottom w:val="single" w:color="8C8C8C" w:sz="4"/>
+              <w:right w:val="single" w:color="8C8C8C" w:sz="4"/>
             </w:tcBorders>
             <w:tcMar>
               <w:top w:type="dxa" w:w="70"/>
@@ -5552,7 +5525,7 @@
           <w:rFonts w:ascii="Arial" w:cs="Arial" w:eastAsia="Arial" w:hAnsi="Arial"/>
           <w:b/>
           <w:bCs/>
-          <w:color w:val="1F4E5F"/>
+          <w:color w:val="1B1B1B"/>
           <w:sz w:val="24"/>
           <w:szCs w:val="24"/>
         </w:rPr>
@@ -5563,12 +5536,12 @@
       <w:tblPr>
         <w:tblW w:type="dxa" w:w="10512"/>
         <w:tblBorders>
-          <w:top w:val="single" w:color="auto" w:sz="4"/>
-          <w:left w:val="single" w:color="auto" w:sz="4"/>
-          <w:bottom w:val="single" w:color="auto" w:sz="4"/>
-          <w:right w:val="single" w:color="auto" w:sz="4"/>
-          <w:insideH w:val="single" w:color="auto" w:sz="4"/>
-          <w:insideV w:val="single" w:color="auto" w:sz="4"/>
+          <w:top w:val="single" w:color="8C8C8C" w:sz="4"/>
+          <w:left w:val="single" w:color="8C8C8C" w:sz="4"/>
+          <w:bottom w:val="single" w:color="8C8C8C" w:sz="4"/>
+          <w:right w:val="single" w:color="8C8C8C" w:sz="4"/>
+          <w:insideH w:val="single" w:color="8C8C8C" w:sz="4"/>
+          <w:insideV w:val="single" w:color="8C8C8C" w:sz="4"/>
         </w:tblBorders>
       </w:tblPr>
       <w:tblGrid>
@@ -5583,26 +5556,25 @@
           <w:tcPr>
             <w:tcW w:type="dxa" w:w="2200"/>
             <w:tcBorders>
-              <w:top w:val="single" w:color="8FA3AA" w:sz="4"/>
-              <w:left w:val="single" w:color="8FA3AA" w:sz="4"/>
-              <w:bottom w:val="single" w:color="8FA3AA" w:sz="4"/>
-              <w:right w:val="single" w:color="8FA3AA" w:sz="4"/>
-            </w:tcBorders>
-            <w:shd w:fill="1F4E5F" w:color="auto" w:val="clear"/>
-            <w:tcMar>
-              <w:top w:type="dxa" w:w="70"/>
-              <w:left w:type="dxa" w:w="90"/>
-              <w:bottom w:type="dxa" w:w="70"/>
-              <w:right w:type="dxa" w:w="90"/>
-            </w:tcMar>
-          </w:tcPr>
-          <w:p>
-            <w:r>
-              <w:rPr>
-                <w:rFonts w:ascii="Arial" w:cs="Arial" w:eastAsia="Arial" w:hAnsi="Arial"/>
-                <w:b/>
-                <w:bCs/>
-                <w:color w:val="FFFFFF"/>
+              <w:top w:val="single" w:color="8C8C8C" w:sz="4"/>
+              <w:left w:val="single" w:color="8C8C8C" w:sz="4"/>
+              <w:bottom w:val="single" w:color="8C8C8C" w:sz="4"/>
+              <w:right w:val="single" w:color="8C8C8C" w:sz="4"/>
+            </w:tcBorders>
+            <w:tcMar>
+              <w:top w:type="dxa" w:w="70"/>
+              <w:left w:type="dxa" w:w="90"/>
+              <w:bottom w:type="dxa" w:w="70"/>
+              <w:right w:type="dxa" w:w="90"/>
+            </w:tcMar>
+          </w:tcPr>
+          <w:p>
+            <w:r>
+              <w:rPr>
+                <w:rFonts w:ascii="Arial" w:cs="Arial" w:eastAsia="Arial" w:hAnsi="Arial"/>
+                <w:b/>
+                <w:bCs/>
+                <w:color w:val="1B1B1B"/>
                 <w:sz w:val="18"/>
                 <w:szCs w:val="18"/>
               </w:rPr>
@@ -5614,10 +5586,10 @@
           <w:tcPr>
             <w:tcW w:type="dxa" w:w="8312"/>
             <w:tcBorders>
-              <w:top w:val="single" w:color="8FA3AA" w:sz="4"/>
-              <w:left w:val="single" w:color="8FA3AA" w:sz="4"/>
-              <w:bottom w:val="single" w:color="8FA3AA" w:sz="4"/>
-              <w:right w:val="single" w:color="8FA3AA" w:sz="4"/>
+              <w:top w:val="single" w:color="8C8C8C" w:sz="4"/>
+              <w:left w:val="single" w:color="8C8C8C" w:sz="4"/>
+              <w:bottom w:val="single" w:color="8C8C8C" w:sz="4"/>
+              <w:right w:val="single" w:color="8C8C8C" w:sz="4"/>
             </w:tcBorders>
             <w:tcMar>
               <w:top w:type="dxa" w:w="70"/>
@@ -5701,26 +5673,25 @@
           <w:tcPr>
             <w:tcW w:type="dxa" w:w="2200"/>
             <w:tcBorders>
-              <w:top w:val="single" w:color="8FA3AA" w:sz="4"/>
-              <w:left w:val="single" w:color="8FA3AA" w:sz="4"/>
-              <w:bottom w:val="single" w:color="8FA3AA" w:sz="4"/>
-              <w:right w:val="single" w:color="8FA3AA" w:sz="4"/>
-            </w:tcBorders>
-            <w:shd w:fill="1F4E5F" w:color="auto" w:val="clear"/>
-            <w:tcMar>
-              <w:top w:type="dxa" w:w="70"/>
-              <w:left w:type="dxa" w:w="90"/>
-              <w:bottom w:type="dxa" w:w="70"/>
-              <w:right w:type="dxa" w:w="90"/>
-            </w:tcMar>
-          </w:tcPr>
-          <w:p>
-            <w:r>
-              <w:rPr>
-                <w:rFonts w:ascii="Arial" w:cs="Arial" w:eastAsia="Arial" w:hAnsi="Arial"/>
-                <w:b/>
-                <w:bCs/>
-                <w:color w:val="FFFFFF"/>
+              <w:top w:val="single" w:color="8C8C8C" w:sz="4"/>
+              <w:left w:val="single" w:color="8C8C8C" w:sz="4"/>
+              <w:bottom w:val="single" w:color="8C8C8C" w:sz="4"/>
+              <w:right w:val="single" w:color="8C8C8C" w:sz="4"/>
+            </w:tcBorders>
+            <w:tcMar>
+              <w:top w:type="dxa" w:w="70"/>
+              <w:left w:type="dxa" w:w="90"/>
+              <w:bottom w:type="dxa" w:w="70"/>
+              <w:right w:type="dxa" w:w="90"/>
+            </w:tcMar>
+          </w:tcPr>
+          <w:p>
+            <w:r>
+              <w:rPr>
+                <w:rFonts w:ascii="Arial" w:cs="Arial" w:eastAsia="Arial" w:hAnsi="Arial"/>
+                <w:b/>
+                <w:bCs/>
+                <w:color w:val="1B1B1B"/>
                 <w:sz w:val="18"/>
                 <w:szCs w:val="18"/>
               </w:rPr>
@@ -5732,10 +5703,10 @@
           <w:tcPr>
             <w:tcW w:type="dxa" w:w="8312"/>
             <w:tcBorders>
-              <w:top w:val="single" w:color="8FA3AA" w:sz="4"/>
-              <w:left w:val="single" w:color="8FA3AA" w:sz="4"/>
-              <w:bottom w:val="single" w:color="8FA3AA" w:sz="4"/>
-              <w:right w:val="single" w:color="8FA3AA" w:sz="4"/>
+              <w:top w:val="single" w:color="8C8C8C" w:sz="4"/>
+              <w:left w:val="single" w:color="8C8C8C" w:sz="4"/>
+              <w:bottom w:val="single" w:color="8C8C8C" w:sz="4"/>
+              <w:right w:val="single" w:color="8C8C8C" w:sz="4"/>
             </w:tcBorders>
             <w:tcMar>
               <w:top w:type="dxa" w:w="70"/>
@@ -5819,26 +5790,25 @@
           <w:tcPr>
             <w:tcW w:type="dxa" w:w="2200"/>
             <w:tcBorders>
-              <w:top w:val="single" w:color="8FA3AA" w:sz="4"/>
-              <w:left w:val="single" w:color="8FA3AA" w:sz="4"/>
-              <w:bottom w:val="single" w:color="8FA3AA" w:sz="4"/>
-              <w:right w:val="single" w:color="8FA3AA" w:sz="4"/>
-            </w:tcBorders>
-            <w:shd w:fill="1F4E5F" w:color="auto" w:val="clear"/>
-            <w:tcMar>
-              <w:top w:type="dxa" w:w="70"/>
-              <w:left w:type="dxa" w:w="90"/>
-              <w:bottom w:type="dxa" w:w="70"/>
-              <w:right w:type="dxa" w:w="90"/>
-            </w:tcMar>
-          </w:tcPr>
-          <w:p>
-            <w:r>
-              <w:rPr>
-                <w:rFonts w:ascii="Arial" w:cs="Arial" w:eastAsia="Arial" w:hAnsi="Arial"/>
-                <w:b/>
-                <w:bCs/>
-                <w:color w:val="FFFFFF"/>
+              <w:top w:val="single" w:color="8C8C8C" w:sz="4"/>
+              <w:left w:val="single" w:color="8C8C8C" w:sz="4"/>
+              <w:bottom w:val="single" w:color="8C8C8C" w:sz="4"/>
+              <w:right w:val="single" w:color="8C8C8C" w:sz="4"/>
+            </w:tcBorders>
+            <w:tcMar>
+              <w:top w:type="dxa" w:w="70"/>
+              <w:left w:type="dxa" w:w="90"/>
+              <w:bottom w:type="dxa" w:w="70"/>
+              <w:right w:type="dxa" w:w="90"/>
+            </w:tcMar>
+          </w:tcPr>
+          <w:p>
+            <w:r>
+              <w:rPr>
+                <w:rFonts w:ascii="Arial" w:cs="Arial" w:eastAsia="Arial" w:hAnsi="Arial"/>
+                <w:b/>
+                <w:bCs/>
+                <w:color w:val="1B1B1B"/>
                 <w:sz w:val="18"/>
                 <w:szCs w:val="18"/>
               </w:rPr>
@@ -5850,10 +5820,10 @@
           <w:tcPr>
             <w:tcW w:type="dxa" w:w="8312"/>
             <w:tcBorders>
-              <w:top w:val="single" w:color="8FA3AA" w:sz="4"/>
-              <w:left w:val="single" w:color="8FA3AA" w:sz="4"/>
-              <w:bottom w:val="single" w:color="8FA3AA" w:sz="4"/>
-              <w:right w:val="single" w:color="8FA3AA" w:sz="4"/>
+              <w:top w:val="single" w:color="8C8C8C" w:sz="4"/>
+              <w:left w:val="single" w:color="8C8C8C" w:sz="4"/>
+              <w:bottom w:val="single" w:color="8C8C8C" w:sz="4"/>
+              <w:right w:val="single" w:color="8C8C8C" w:sz="4"/>
             </w:tcBorders>
             <w:tcMar>
               <w:top w:type="dxa" w:w="70"/>
@@ -5894,7 +5864,7 @@
           <w:rFonts w:ascii="Arial" w:cs="Arial" w:eastAsia="Arial" w:hAnsi="Arial"/>
           <w:b/>
           <w:bCs/>
-          <w:color w:val="1F4E5F"/>
+          <w:color w:val="1B1B1B"/>
           <w:sz w:val="24"/>
           <w:szCs w:val="24"/>
         </w:rPr>

</xml_diff>